<commit_message>
Harden municipal student data privacy
</commit_message>
<xml_diff>
--- a/docs/legal/SkoleGPS_standarddatabehandleraftale.docx
+++ b/docs/legal/SkoleGPS_standarddatabehandleraftale.docx
@@ -8,28 +8,13 @@
         <w:jc w:val="center"/>
       </w:pPr>
       <w:r>
-        <w:rPr>
-          <w:b/>
-          <w:color w:val="064E3B"/>
-          <w:sz w:val="20"/>
-        </w:rPr>
         <w:t>STANDARD DATABEHANDLERAFTALE – IKKE UNDERSKREVET</w:t>
       </w:r>
       <w:r>
-        <w:rPr>
-          <w:b/>
-          <w:color w:val="064E3B"/>
-          <w:sz w:val="20"/>
-        </w:rPr>
         <w:br/>
-        <w:t>Version 1.0 · Udgivet og senest opdateret 7. august 2026 · Dokumentansvarlig: Jeppe Laursen, SkoleGPS.dk</w:t>
-      </w:r>
-      <w:r>
-        <w:rPr>
-          <w:b/>
-          <w:color w:val="064E3B"/>
-          <w:sz w:val="20"/>
-        </w:rPr>
+        <w:t>Version 1.1 · Udgivet og senest opdateret 8. august 2026 · Dokumentansvarlig: Jeppe Laursen, SkoleGPS.dk</w:t>
+      </w:r>
+      <w:r>
         <w:br/>
         <w:t>Standardskabelonen skal udfyldes, vurderes og underskrives af den konkrete kommune/skoleejer og SkoleGPS. Den er ikke en myndighedsgodkendelse eller juridisk rådgivning.</w:t>
       </w:r>
@@ -47,13 +32,7 @@
         <w:jc w:val="both"/>
       </w:pPr>
       <w:r>
-        <w:t>i henhold til artikel 28, stk. 3, i forordning 2016/679 (databeskyttelsesforordningen) med henblik på databehandler</w:t>
-      </w:r>
-      <w:r>
-        <w:t>en</w:t>
-      </w:r>
-      <w:r>
-        <w:t>s behandling af personoplysninger</w:t>
+        <w:t>i henhold til artikel 28, stk. 3, i forordning 2016/679 (databeskyttelsesforordningen) med henblik på databehandlerens behandling af personoplysninger</w:t>
       </w:r>
     </w:p>
     <w:p>
@@ -242,10 +221,7 @@
         <w:jc w:val="both"/>
       </w:pPr>
       <w:r>
-        <w:t>HAR AFTALT følgende standardkontraktsbestemmelser (</w:t>
-      </w:r>
-      <w:r>
-        <w:t>B</w:t>
+        <w:t>HAR AFTALT følgende standardkontraktsbestemmelser (B</w:t>
       </w:r>
       <w:r>
         <w:t>estemmelserne) med henblik på at overholde databeskyttelsesforordningen og sikre beskyttelse af privatlivets fred og fysiske personers grundlæggende rettigheder og frihedsrettigheder</w:t>
@@ -310,7 +286,7 @@
           <w:r>
             <w:fldChar w:fldCharType="separate"/>
           </w:r>
-          <w:hyperlink w:anchor="_Toc237035738" w:history="1">
+          <w:hyperlink w:anchor="_Toc237039920" w:history="1">
             <w:r>
               <w:rPr>
                 <w:rStyle w:val="Hyperlink"/>
@@ -337,7 +313,7 @@
                 <w:noProof/>
                 <w:webHidden/>
               </w:rPr>
-              <w:instrText xml:space="preserve"> PAGEREF _Toc237035738 \h </w:instrText>
+              <w:instrText xml:space="preserve"> PAGEREF _Toc237039920 \h </w:instrText>
             </w:r>
             <w:r>
               <w:rPr>
@@ -384,7 +360,7 @@
               <w14:ligatures w14:val="standardContextual"/>
             </w:rPr>
           </w:pPr>
-          <w:hyperlink w:anchor="_Toc237035739" w:history="1">
+          <w:hyperlink w:anchor="_Toc237039921" w:history="1">
             <w:r>
               <w:rPr>
                 <w:rStyle w:val="Hyperlink"/>
@@ -411,7 +387,7 @@
                 <w:noProof/>
                 <w:webHidden/>
               </w:rPr>
-              <w:instrText xml:space="preserve"> PAGEREF _Toc237035739 \h </w:instrText>
+              <w:instrText xml:space="preserve"> PAGEREF _Toc237039921 \h </w:instrText>
             </w:r>
             <w:r>
               <w:rPr>
@@ -458,7 +434,7 @@
               <w14:ligatures w14:val="standardContextual"/>
             </w:rPr>
           </w:pPr>
-          <w:hyperlink w:anchor="_Toc237035740" w:history="1">
+          <w:hyperlink w:anchor="_Toc237039922" w:history="1">
             <w:r>
               <w:rPr>
                 <w:rStyle w:val="Hyperlink"/>
@@ -485,7 +461,7 @@
                 <w:noProof/>
                 <w:webHidden/>
               </w:rPr>
-              <w:instrText xml:space="preserve"> PAGEREF _Toc237035740 \h </w:instrText>
+              <w:instrText xml:space="preserve"> PAGEREF _Toc237039922 \h </w:instrText>
             </w:r>
             <w:r>
               <w:rPr>
@@ -532,7 +508,7 @@
               <w14:ligatures w14:val="standardContextual"/>
             </w:rPr>
           </w:pPr>
-          <w:hyperlink w:anchor="_Toc237035741" w:history="1">
+          <w:hyperlink w:anchor="_Toc237039923" w:history="1">
             <w:r>
               <w:rPr>
                 <w:rStyle w:val="Hyperlink"/>
@@ -559,7 +535,7 @@
                 <w:noProof/>
                 <w:webHidden/>
               </w:rPr>
-              <w:instrText xml:space="preserve"> PAGEREF _Toc237035741 \h </w:instrText>
+              <w:instrText xml:space="preserve"> PAGEREF _Toc237039923 \h </w:instrText>
             </w:r>
             <w:r>
               <w:rPr>
@@ -606,7 +582,7 @@
               <w14:ligatures w14:val="standardContextual"/>
             </w:rPr>
           </w:pPr>
-          <w:hyperlink w:anchor="_Toc237035742" w:history="1">
+          <w:hyperlink w:anchor="_Toc237039924" w:history="1">
             <w:r>
               <w:rPr>
                 <w:rStyle w:val="Hyperlink"/>
@@ -633,7 +609,7 @@
                 <w:noProof/>
                 <w:webHidden/>
               </w:rPr>
-              <w:instrText xml:space="preserve"> PAGEREF _Toc237035742 \h </w:instrText>
+              <w:instrText xml:space="preserve"> PAGEREF _Toc237039924 \h </w:instrText>
             </w:r>
             <w:r>
               <w:rPr>
@@ -680,7 +656,7 @@
               <w14:ligatures w14:val="standardContextual"/>
             </w:rPr>
           </w:pPr>
-          <w:hyperlink w:anchor="_Toc237035743" w:history="1">
+          <w:hyperlink w:anchor="_Toc237039925" w:history="1">
             <w:r>
               <w:rPr>
                 <w:rStyle w:val="Hyperlink"/>
@@ -707,7 +683,7 @@
                 <w:noProof/>
                 <w:webHidden/>
               </w:rPr>
-              <w:instrText xml:space="preserve"> PAGEREF _Toc237035743 \h </w:instrText>
+              <w:instrText xml:space="preserve"> PAGEREF _Toc237039925 \h </w:instrText>
             </w:r>
             <w:r>
               <w:rPr>
@@ -754,7 +730,7 @@
               <w14:ligatures w14:val="standardContextual"/>
             </w:rPr>
           </w:pPr>
-          <w:hyperlink w:anchor="_Toc237035744" w:history="1">
+          <w:hyperlink w:anchor="_Toc237039926" w:history="1">
             <w:r>
               <w:rPr>
                 <w:rStyle w:val="Hyperlink"/>
@@ -781,7 +757,7 @@
                 <w:noProof/>
                 <w:webHidden/>
               </w:rPr>
-              <w:instrText xml:space="preserve"> PAGEREF _Toc237035744 \h </w:instrText>
+              <w:instrText xml:space="preserve"> PAGEREF _Toc237039926 \h </w:instrText>
             </w:r>
             <w:r>
               <w:rPr>
@@ -828,7 +804,7 @@
               <w14:ligatures w14:val="standardContextual"/>
             </w:rPr>
           </w:pPr>
-          <w:hyperlink w:anchor="_Toc237035745" w:history="1">
+          <w:hyperlink w:anchor="_Toc237039927" w:history="1">
             <w:r>
               <w:rPr>
                 <w:rStyle w:val="Hyperlink"/>
@@ -855,7 +831,7 @@
                 <w:noProof/>
                 <w:webHidden/>
               </w:rPr>
-              <w:instrText xml:space="preserve"> PAGEREF _Toc237035745 \h </w:instrText>
+              <w:instrText xml:space="preserve"> PAGEREF _Toc237039927 \h </w:instrText>
             </w:r>
             <w:r>
               <w:rPr>
@@ -902,7 +878,7 @@
               <w14:ligatures w14:val="standardContextual"/>
             </w:rPr>
           </w:pPr>
-          <w:hyperlink w:anchor="_Toc237035746" w:history="1">
+          <w:hyperlink w:anchor="_Toc237039928" w:history="1">
             <w:r>
               <w:rPr>
                 <w:rStyle w:val="Hyperlink"/>
@@ -929,7 +905,7 @@
                 <w:noProof/>
                 <w:webHidden/>
               </w:rPr>
-              <w:instrText xml:space="preserve"> PAGEREF _Toc237035746 \h </w:instrText>
+              <w:instrText xml:space="preserve"> PAGEREF _Toc237039928 \h </w:instrText>
             </w:r>
             <w:r>
               <w:rPr>
@@ -976,7 +952,7 @@
               <w14:ligatures w14:val="standardContextual"/>
             </w:rPr>
           </w:pPr>
-          <w:hyperlink w:anchor="_Toc237035747" w:history="1">
+          <w:hyperlink w:anchor="_Toc237039929" w:history="1">
             <w:r>
               <w:rPr>
                 <w:rStyle w:val="Hyperlink"/>
@@ -1003,7 +979,7 @@
                 <w:noProof/>
                 <w:webHidden/>
               </w:rPr>
-              <w:instrText xml:space="preserve"> PAGEREF _Toc237035747 \h </w:instrText>
+              <w:instrText xml:space="preserve"> PAGEREF _Toc237039929 \h </w:instrText>
             </w:r>
             <w:r>
               <w:rPr>
@@ -1050,7 +1026,7 @@
               <w14:ligatures w14:val="standardContextual"/>
             </w:rPr>
           </w:pPr>
-          <w:hyperlink w:anchor="_Toc237035748" w:history="1">
+          <w:hyperlink w:anchor="_Toc237039930" w:history="1">
             <w:r>
               <w:rPr>
                 <w:rStyle w:val="Hyperlink"/>
@@ -1077,7 +1053,7 @@
                 <w:noProof/>
                 <w:webHidden/>
               </w:rPr>
-              <w:instrText xml:space="preserve"> PAGEREF _Toc237035748 \h </w:instrText>
+              <w:instrText xml:space="preserve"> PAGEREF _Toc237039930 \h </w:instrText>
             </w:r>
             <w:r>
               <w:rPr>
@@ -1124,7 +1100,7 @@
               <w14:ligatures w14:val="standardContextual"/>
             </w:rPr>
           </w:pPr>
-          <w:hyperlink w:anchor="_Toc237035749" w:history="1">
+          <w:hyperlink w:anchor="_Toc237039931" w:history="1">
             <w:r>
               <w:rPr>
                 <w:rStyle w:val="Hyperlink"/>
@@ -1151,7 +1127,7 @@
                 <w:noProof/>
                 <w:webHidden/>
               </w:rPr>
-              <w:instrText xml:space="preserve"> PAGEREF _Toc237035749 \h </w:instrText>
+              <w:instrText xml:space="preserve"> PAGEREF _Toc237039931 \h </w:instrText>
             </w:r>
             <w:r>
               <w:rPr>
@@ -1198,7 +1174,7 @@
               <w14:ligatures w14:val="standardContextual"/>
             </w:rPr>
           </w:pPr>
-          <w:hyperlink w:anchor="_Toc237035750" w:history="1">
+          <w:hyperlink w:anchor="_Toc237039932" w:history="1">
             <w:r>
               <w:rPr>
                 <w:rStyle w:val="Hyperlink"/>
@@ -1225,7 +1201,7 @@
                 <w:noProof/>
                 <w:webHidden/>
               </w:rPr>
-              <w:instrText xml:space="preserve"> PAGEREF _Toc237035750 \h </w:instrText>
+              <w:instrText xml:space="preserve"> PAGEREF _Toc237039932 \h </w:instrText>
             </w:r>
             <w:r>
               <w:rPr>
@@ -1272,7 +1248,7 @@
               <w14:ligatures w14:val="standardContextual"/>
             </w:rPr>
           </w:pPr>
-          <w:hyperlink w:anchor="_Toc237035751" w:history="1">
+          <w:hyperlink w:anchor="_Toc237039933" w:history="1">
             <w:r>
               <w:rPr>
                 <w:rStyle w:val="Hyperlink"/>
@@ -1299,7 +1275,7 @@
                 <w:noProof/>
                 <w:webHidden/>
               </w:rPr>
-              <w:instrText xml:space="preserve"> PAGEREF _Toc237035751 \h </w:instrText>
+              <w:instrText xml:space="preserve"> PAGEREF _Toc237039933 \h </w:instrText>
             </w:r>
             <w:r>
               <w:rPr>
@@ -1347,7 +1323,7 @@
               <w14:ligatures w14:val="standardContextual"/>
             </w:rPr>
           </w:pPr>
-          <w:hyperlink w:anchor="_Toc237035752" w:history="1">
+          <w:hyperlink w:anchor="_Toc237039934" w:history="1">
             <w:r>
               <w:rPr>
                 <w:rStyle w:val="Hyperlink"/>
@@ -1393,7 +1369,7 @@
                 <w:noProof/>
                 <w:webHidden/>
               </w:rPr>
-              <w:instrText xml:space="preserve"> PAGEREF _Toc237035752 \h </w:instrText>
+              <w:instrText xml:space="preserve"> PAGEREF _Toc237039934 \h </w:instrText>
             </w:r>
             <w:r>
               <w:rPr>
@@ -1441,7 +1417,7 @@
               <w14:ligatures w14:val="standardContextual"/>
             </w:rPr>
           </w:pPr>
-          <w:hyperlink w:anchor="_Toc237035753" w:history="1">
+          <w:hyperlink w:anchor="_Toc237039935" w:history="1">
             <w:r>
               <w:rPr>
                 <w:rStyle w:val="Hyperlink"/>
@@ -1487,7 +1463,7 @@
                 <w:noProof/>
                 <w:webHidden/>
               </w:rPr>
-              <w:instrText xml:space="preserve"> PAGEREF _Toc237035753 \h </w:instrText>
+              <w:instrText xml:space="preserve"> PAGEREF _Toc237039935 \h </w:instrText>
             </w:r>
             <w:r>
               <w:rPr>
@@ -1535,7 +1511,7 @@
               <w14:ligatures w14:val="standardContextual"/>
             </w:rPr>
           </w:pPr>
-          <w:hyperlink w:anchor="_Toc237035754" w:history="1">
+          <w:hyperlink w:anchor="_Toc237039936" w:history="1">
             <w:r>
               <w:rPr>
                 <w:rStyle w:val="Hyperlink"/>
@@ -1581,7 +1557,7 @@
                 <w:noProof/>
                 <w:webHidden/>
               </w:rPr>
-              <w:instrText xml:space="preserve"> PAGEREF _Toc237035754 \h </w:instrText>
+              <w:instrText xml:space="preserve"> PAGEREF _Toc237039936 \h </w:instrText>
             </w:r>
             <w:r>
               <w:rPr>
@@ -1629,7 +1605,7 @@
               <w14:ligatures w14:val="standardContextual"/>
             </w:rPr>
           </w:pPr>
-          <w:hyperlink w:anchor="_Toc237035755" w:history="1">
+          <w:hyperlink w:anchor="_Toc237039937" w:history="1">
             <w:r>
               <w:rPr>
                 <w:rStyle w:val="Hyperlink"/>
@@ -1675,7 +1651,7 @@
                 <w:noProof/>
                 <w:webHidden/>
               </w:rPr>
-              <w:instrText xml:space="preserve"> PAGEREF _Toc237035755 \h </w:instrText>
+              <w:instrText xml:space="preserve"> PAGEREF _Toc237039937 \h </w:instrText>
             </w:r>
             <w:r>
               <w:rPr>
@@ -1729,7 +1705,7 @@
       <w:pPr>
         <w:pStyle w:val="Overskrift1"/>
       </w:pPr>
-      <w:bookmarkStart w:id="0" w:name="_Toc237035738"/>
+      <w:bookmarkStart w:id="0" w:name="_Toc237039920"/>
       <w:r>
         <w:lastRenderedPageBreak/>
         <w:t>Præambel</w:t>
@@ -1747,19 +1723,7 @@
         <w:jc w:val="both"/>
       </w:pPr>
       <w:r>
-        <w:t xml:space="preserve">Disse </w:t>
-      </w:r>
-      <w:r>
-        <w:t>Bestemmelser</w:t>
-      </w:r>
-      <w:r>
-        <w:t xml:space="preserve"> fastsætter </w:t>
-      </w:r>
-      <w:r>
-        <w:t>databehandlerens rettigheder og forpligtelser</w:t>
-      </w:r>
-      <w:r>
-        <w:t>, når denne foretager behandling af personoplysninger på vegne af den dataansvarlige.</w:t>
+        <w:t>Disse Bestemmelser fastsætter databehandlerens rettigheder og forpligtelser, når denne foretager behandling af personoplysninger på vegne af den dataansvarlige.</w:t>
       </w:r>
     </w:p>
     <w:p>
@@ -1833,19 +1797,7 @@
         <w:jc w:val="both"/>
       </w:pPr>
       <w:r>
-        <w:t xml:space="preserve">Der hører fire bilag til disse </w:t>
-      </w:r>
-      <w:r>
-        <w:t>B</w:t>
-      </w:r>
-      <w:r>
-        <w:t xml:space="preserve">estemmelser, og bilagene udgør en integreret del af </w:t>
-      </w:r>
-      <w:r>
-        <w:t>B</w:t>
-      </w:r>
-      <w:r>
-        <w:t>estemmelserne.</w:t>
+        <w:t>Der hører fire bilag til disse Bestemmelser, og bilagene udgør en integreret del af Bestemmelserne.</w:t>
       </w:r>
     </w:p>
     <w:p>
@@ -1866,10 +1818,7 @@
         <w:t>Bilag A indeholder nærmere oplysninger om behandlingen</w:t>
       </w:r>
       <w:r>
-        <w:t xml:space="preserve"> af personoplysninger</w:t>
-      </w:r>
-      <w:r>
-        <w:t>, herunder om behandlingens formål og karakter, typen af personoplysninger, kategorierne af registrerede og varighed af behandlingen.</w:t>
+        <w:t xml:space="preserve"> af personoplysninger, herunder om behandlingens formål og karakter, typen af personoplysninger, kategorierne af registrerede og varighed af behandlingen.</w:t>
       </w:r>
     </w:p>
     <w:p>
@@ -1887,19 +1836,7 @@
         <w:jc w:val="both"/>
       </w:pPr>
       <w:r>
-        <w:t xml:space="preserve">Bilag B </w:t>
-      </w:r>
-      <w:r>
-        <w:t>indeholder den</w:t>
-      </w:r>
-      <w:r>
-        <w:t xml:space="preserve"> dataansvarliges betingelser for databehandlerens brug af underdatabehandlere og en liste af underdatabeh</w:t>
-      </w:r>
-      <w:r>
-        <w:t>andlere</w:t>
-      </w:r>
-      <w:r>
-        <w:t>, som den dataansvarlige har godkendt brugen af.</w:t>
+        <w:t>Bilag B indeholder den dataansvarliges betingelser for databehandlerens brug af underdatabehandlere og en liste af underdatabehandlere, som den dataansvarlige har godkendt brugen af.</w:t>
       </w:r>
     </w:p>
     <w:p>
@@ -1917,22 +1854,10 @@
         <w:jc w:val="both"/>
       </w:pPr>
       <w:r>
-        <w:t>Bilag C</w:t>
-      </w:r>
-      <w:r>
-        <w:t xml:space="preserve"> indeholder den dataansvarliges instruks for så vidt angår databehandlerens behandling af perso</w:t>
-      </w:r>
-      <w:r>
-        <w:t>noplysninger, en beskrivelse af</w:t>
-      </w:r>
-      <w:r>
-        <w:t xml:space="preserve"> de sikkerhedsforanstaltninger, som databehandleren som minimum skal </w:t>
-      </w:r>
-      <w:r>
-        <w:t>gennemføre</w:t>
-      </w:r>
-      <w:r>
-        <w:t>, og hvordan der føres tilsyn med databehandleren og eventuelle underdatabehandlere.</w:t>
+        <w:t>Bilag C indeholder den dataansvarliges instruks for så vidt angår databehandlerens behandling af personoplysninger, en beskrivelse af</w:t>
+      </w:r>
+      <w:r>
+        <w:t xml:space="preserve"> de sikkerhedsforanstaltninger, som databehandleren som minimum skal gennemføre, og hvordan der føres tilsyn med databehandleren og eventuelle underdatabehandlere.</w:t>
       </w:r>
     </w:p>
     <w:p>
@@ -1950,16 +1875,7 @@
         <w:jc w:val="both"/>
       </w:pPr>
       <w:r>
-        <w:t>Bilag D</w:t>
-      </w:r>
-      <w:r>
-        <w:t xml:space="preserve"> indeholder bestemmelser vedrørende andre aktiviteter, som ikke af omfattet af </w:t>
-      </w:r>
-      <w:r>
-        <w:t>B</w:t>
-      </w:r>
-      <w:r>
-        <w:t>estemmelserne.</w:t>
+        <w:t>Bilag D indeholder bestemmelser vedrørende andre aktiviteter, som ikke af omfattet af Bestemmelserne.</w:t>
       </w:r>
     </w:p>
     <w:p>
@@ -1977,16 +1893,7 @@
         <w:jc w:val="both"/>
       </w:pPr>
       <w:r>
-        <w:t>B</w:t>
-      </w:r>
-      <w:r>
-        <w:t>estemmelser</w:t>
-      </w:r>
-      <w:r>
-        <w:t>ne</w:t>
-      </w:r>
-      <w:r>
-        <w:t xml:space="preserve"> med tilhørende bilag skal opbevares skriftligt, herunder elektronisk, af begge parter.</w:t>
+        <w:t>Bestemmelserne med tilhørende bilag skal opbevares skriftligt, herunder elektronisk, af begge parter.</w:t>
       </w:r>
     </w:p>
     <w:p>
@@ -2004,16 +1911,7 @@
         <w:jc w:val="both"/>
       </w:pPr>
       <w:r>
-        <w:t xml:space="preserve">Disse </w:t>
-      </w:r>
-      <w:r>
-        <w:t>B</w:t>
-      </w:r>
-      <w:r>
-        <w:t xml:space="preserve">estemmelser frigør ikke databehandleren fra forpligtelser, </w:t>
-      </w:r>
-      <w:r>
-        <w:t xml:space="preserve">som databehandleren er pålagt </w:t>
+        <w:t xml:space="preserve">Disse Bestemmelser frigør ikke databehandleren fra forpligtelser, som databehandleren er pålagt </w:t>
       </w:r>
       <w:r>
         <w:t>efter databeskyttelsesforordningen eller enhver anden lovgivning.</w:t>
@@ -2023,7 +1921,7 @@
       <w:pPr>
         <w:pStyle w:val="Overskrift1"/>
       </w:pPr>
-      <w:bookmarkStart w:id="1" w:name="_Toc237035739"/>
+      <w:bookmarkStart w:id="1" w:name="_Toc237039921"/>
       <w:r>
         <w:t>Den dataansvarliges rettigheder og forpligtelser</w:t>
       </w:r>
@@ -2044,19 +1942,7 @@
         <w:jc w:val="both"/>
       </w:pPr>
       <w:r>
-        <w:t xml:space="preserve">Den dataansvarlige er ansvarlig for at sikre, at behandlingen af personoplysninger sker i overensstemmelse med databeskyttelsesforordningen (se forordningens artikel 24), </w:t>
-      </w:r>
-      <w:r>
-        <w:t xml:space="preserve">databeskyttelsesbestemmelser i anden </w:t>
-      </w:r>
-      <w:r>
-        <w:t xml:space="preserve">EU-ret </w:t>
-      </w:r>
-      <w:r>
-        <w:t xml:space="preserve">eller </w:t>
-      </w:r>
-      <w:r>
-        <w:t>medlemsstaternes</w:t>
+        <w:t>Den dataansvarlige er ansvarlig for at sikre, at behandlingen af personoplysninger sker i overensstemmelse med databeskyttelsesforordningen (se forordningens artikel 24), databeskyttelsesbestemmelser i anden EU-ret eller medlemsstaternes</w:t>
       </w:r>
       <w:r>
         <w:rPr>
@@ -2065,13 +1951,7 @@
         <w:footnoteReference w:id="1"/>
       </w:r>
       <w:r>
-        <w:t xml:space="preserve"> nationale ret og </w:t>
-      </w:r>
-      <w:r>
-        <w:t>disse Bestemmelser</w:t>
-      </w:r>
-      <w:r>
-        <w:t>.</w:t>
+        <w:t xml:space="preserve"> nationale ret og disse Bestemmelser.</w:t>
       </w:r>
     </w:p>
     <w:p>
@@ -2091,19 +1971,7 @@
       </w:pPr>
       <w:r>
         <w:lastRenderedPageBreak/>
-        <w:t xml:space="preserve">Den dataansvarlige har ret og pligt til at træffe </w:t>
-      </w:r>
-      <w:r>
-        <w:t>beslutning</w:t>
-      </w:r>
-      <w:r>
-        <w:t>er</w:t>
-      </w:r>
-      <w:r>
-        <w:t xml:space="preserve"> om</w:t>
-      </w:r>
-      <w:r>
-        <w:t>,</w:t>
+        <w:t>Den dataansvarlige har ret og pligt til at træffe beslutninger om,</w:t>
       </w:r>
       <w:r>
         <w:t xml:space="preserve"> til hvilke(t) formål og med hvilke hjælpemidler, der må ske behandling af personoplysninger.</w:t>
@@ -2132,7 +2000,7 @@
       <w:pPr>
         <w:pStyle w:val="Overskrift1"/>
       </w:pPr>
-      <w:bookmarkStart w:id="2" w:name="_Toc237035740"/>
+      <w:bookmarkStart w:id="2" w:name="_Toc237039922"/>
       <w:r>
         <w:t>Databehandleren handler efter instruks</w:t>
       </w:r>
@@ -2149,34 +2017,10 @@
         <w:jc w:val="both"/>
       </w:pPr>
       <w:r>
-        <w:t>Databehandleren må kun behandle personoplysninger efter dokumenteret instruks fra den dataansvarlige</w:t>
-      </w:r>
-      <w:r>
-        <w:t>, medmindre det kræves i henhold til EU-ret eller medlemsstaternes na</w:t>
-      </w:r>
-      <w:r>
-        <w:t>tionale ret, som databehandleren</w:t>
-      </w:r>
-      <w:r>
-        <w:t xml:space="preserve"> er underlagt</w:t>
-      </w:r>
-      <w:r>
-        <w:t xml:space="preserve">. Denne instruks skal være specificeret i bilag A og C. Efterfølgende </w:t>
-      </w:r>
-      <w:r>
-        <w:t>instruks kan også gives af den dataansvarlige</w:t>
-      </w:r>
-      <w:r>
-        <w:t>,</w:t>
-      </w:r>
-      <w:r>
-        <w:t xml:space="preserve"> mens der sker behandling af personoplysninger, men instruksen skal altid være dokumenteret og opbevares skriftligt, herunder elektronisk, sammen med</w:t>
-      </w:r>
-      <w:r>
-        <w:t xml:space="preserve"> disse Bestemmelser</w:t>
-      </w:r>
-      <w:r>
-        <w:t>.</w:t>
+        <w:t>Databehandleren må kun behandle personoplysninger efter dokumenteret instruks fra den dataansvarlige, medmindre det kræves i henhold til EU-ret eller medlemsstaternes na</w:t>
+      </w:r>
+      <w:r>
+        <w:t>tionale ret, som databehandleren er underlagt. Denne instruks skal være specificeret i bilag A og C. Efterfølgende instruks kan også gives af den dataansvarlige, mens der sker behandling af personoplysninger, men instruksen skal altid være dokumenteret og opbevares skriftligt, herunder elektronisk, sammen med disse Bestemmelser.</w:t>
       </w:r>
     </w:p>
     <w:p>
@@ -2195,10 +2039,7 @@
         <w:jc w:val="both"/>
       </w:pPr>
       <w:r>
-        <w:t>Databehandleren underrette</w:t>
-      </w:r>
-      <w:r>
-        <w:t>r omgående</w:t>
+        <w:t>Databehandleren underretter omgående</w:t>
       </w:r>
       <w:r>
         <w:t xml:space="preserve"> den dataansvarlige, hvis en instruks efter vedkommendes mening er i strid med denne forordning eller databeskyttelsesbestemmelser i anden EU-ret eller medlemsstaternes nationale ret.</w:t>
@@ -2219,7 +2060,7 @@
       <w:pPr>
         <w:pStyle w:val="Overskrift1"/>
       </w:pPr>
-      <w:bookmarkStart w:id="3" w:name="_Toc237035741"/>
+      <w:bookmarkStart w:id="3" w:name="_Toc237039923"/>
       <w:r>
         <w:t>Fortrolighed</w:t>
       </w:r>
@@ -2236,67 +2077,10 @@
         <w:jc w:val="both"/>
       </w:pPr>
       <w:r>
-        <w:t>Databehandleren må kun give adgang til personoplysninger, som behandles på den dataansvarliges vegne, til personer</w:t>
-      </w:r>
-      <w:r>
-        <w:t>,</w:t>
-      </w:r>
-      <w:r>
-        <w:t xml:space="preserve"> </w:t>
-      </w:r>
-      <w:r>
-        <w:t xml:space="preserve">som er underlagt </w:t>
-      </w:r>
-      <w:r>
-        <w:t xml:space="preserve">databehandlerens </w:t>
-      </w:r>
-      <w:r>
-        <w:t>instruktionsbeføjelser</w:t>
-      </w:r>
-      <w:r>
-        <w:t>,</w:t>
-      </w:r>
-      <w:r>
-        <w:t xml:space="preserve"> </w:t>
-      </w:r>
-      <w:r>
-        <w:t xml:space="preserve">som har forpligtet sig til fortrolighed </w:t>
-      </w:r>
-      <w:r>
-        <w:t xml:space="preserve">eller er underlagt en passende lovbestemt tavshedspligt, og </w:t>
-      </w:r>
-      <w:r>
-        <w:t>kun i det nødvendige omfang</w:t>
-      </w:r>
-      <w:r>
-        <w:t xml:space="preserve">. Listen af personer, som har fået </w:t>
-      </w:r>
-      <w:r>
-        <w:t xml:space="preserve">tildelt </w:t>
-      </w:r>
-      <w:r>
-        <w:t xml:space="preserve">adgang, skal </w:t>
-      </w:r>
-      <w:r>
-        <w:t>løbende gennemgås. På baggrund af denne gennemgang kan adgang</w:t>
-      </w:r>
-      <w:r>
-        <w:t>en</w:t>
-      </w:r>
-      <w:r>
-        <w:t xml:space="preserve"> til personoplysninger </w:t>
-      </w:r>
-      <w:r>
-        <w:t>lukkes</w:t>
-      </w:r>
-      <w:r>
-        <w:t>, hvis adgangen ikke længere er nødvendig, og personoplysninger</w:t>
-      </w:r>
-      <w:r>
-        <w:t>ne</w:t>
-      </w:r>
-      <w:r>
-        <w:t xml:space="preserve"> skal herefter ikke længere være tilgængelige for disse personer.</w:t>
+        <w:t>Databehandleren må kun give adgang til personoplysninger, som behandles på den dataansvarliges vegne, til personer, som er underlagt databehandlerens instruktionsbeføjelser, som har forpligtet sig til fortrolighed eller er underlagt en passende lovbestemt tavshedspligt, og kun i det nødvendige omfang</w:t>
+      </w:r>
+      <w:r>
+        <w:t>. Listen af personer, som har fået tildelt adgang, skal løbende gennemgås. På baggrund af denne gennemgang kan adgangen til personoplysninger lukkes, hvis adgangen ikke længere er nødvendig, og personoplysningerne skal herefter ikke længere være tilgængelige for disse personer.</w:t>
       </w:r>
     </w:p>
     <w:p>
@@ -2315,44 +2099,14 @@
         <w:jc w:val="both"/>
       </w:pPr>
       <w:r>
-        <w:t xml:space="preserve">Databehandleren skal </w:t>
-      </w:r>
-      <w:r>
-        <w:t xml:space="preserve">efter anmodning fra </w:t>
-      </w:r>
-      <w:r>
-        <w:t>den da</w:t>
-      </w:r>
-      <w:r>
-        <w:t>taansvarlige</w:t>
-      </w:r>
-      <w:r>
-        <w:t xml:space="preserve"> </w:t>
-      </w:r>
-      <w:r>
-        <w:t xml:space="preserve">kunne </w:t>
-      </w:r>
-      <w:r>
-        <w:t>på</w:t>
-      </w:r>
-      <w:r>
-        <w:t xml:space="preserve">vise, at de pågældende personer, som er underlagt </w:t>
-      </w:r>
-      <w:r>
-        <w:t xml:space="preserve">databehandlerens </w:t>
-      </w:r>
-      <w:r>
-        <w:t xml:space="preserve">instruktionsbeføjelser, </w:t>
-      </w:r>
-      <w:r>
-        <w:t>er underlagt ovennævnte tavshedspligt.</w:t>
+        <w:t>Databehandleren skal efter anmodning fra den dataansvarlige kunne påvise, at de pågældende personer, som er underlagt databehandlerens instruktionsbeføjelser, er underlagt ovennævnte tavshedspligt.</w:t>
       </w:r>
     </w:p>
     <w:p>
       <w:pPr>
         <w:pStyle w:val="Overskrift1"/>
       </w:pPr>
-      <w:bookmarkStart w:id="4" w:name="_Toc237035742"/>
+      <w:bookmarkStart w:id="4" w:name="_Toc237039924"/>
       <w:r>
         <w:t>Behandlingssikkerhed</w:t>
       </w:r>
@@ -2369,36 +2123,21 @@
         <w:jc w:val="both"/>
       </w:pPr>
       <w:r>
-        <w:t>Databeskyttelsesforordningens artikel 32 fastslår, at den dataansvarlige og databehandleren, under hensyntagen til det aktuelle tekniske niveau, implementeringsomkostningerne og den pågældende behandlings karakter, omfang, sammenhæng og formål samt risiciene af varierende sandsynlighed og alvor for fysiske personers rettigheder og frihedsrettigheder, gennemfører passende tekniske og organisatoriske foranstaltninger for at sikre et beskyttelsesniveau,</w:t>
-      </w:r>
-      <w:r>
-        <w:t xml:space="preserve"> der passer til disse risici.</w:t>
-      </w:r>
-    </w:p>
-    <w:p>
-      <w:pPr>
-        <w:pStyle w:val="Listeafsnit"/>
-      </w:pPr>
-    </w:p>
-    <w:p>
-      <w:pPr>
-        <w:pStyle w:val="Listeafsnit"/>
-        <w:jc w:val="both"/>
-      </w:pPr>
-      <w:r>
-        <w:t>Den dataansvarlige skal vurdere risiciene for fysiske personers rettigheder og frihedsrettigheder som behandling</w:t>
-      </w:r>
-      <w:r>
-        <w:t>en</w:t>
-      </w:r>
-      <w:r>
-        <w:t xml:space="preserve"> udgør og gennemføre foranstaltninger for at </w:t>
-      </w:r>
-      <w:r>
-        <w:t>imødegå</w:t>
-      </w:r>
-      <w:r>
-        <w:t xml:space="preserve"> disse risici. Afhængig af deres relevans kan det omfatte:</w:t>
+        <w:t>Databeskyttelsesforordningens artikel 32 fastslår, at den dataansvarlige og databehandleren, under hensyntagen til det aktuelle tekniske niveau, implementeringsomkostningerne og den pågældende behandlings karakter, omfang, sammenhæng og formål samt risiciene af varierende sandsynlighed og alvor for fysiske personers rettigheder og frihedsrettigheder, gennemfører passende tekniske og organisatoriske foranstaltninger for at sikre et beskyttelsesniveau, der passer til disse risici.</w:t>
+      </w:r>
+    </w:p>
+    <w:p>
+      <w:pPr>
+        <w:pStyle w:val="Listeafsnit"/>
+      </w:pPr>
+    </w:p>
+    <w:p>
+      <w:pPr>
+        <w:pStyle w:val="Listeafsnit"/>
+        <w:jc w:val="both"/>
+      </w:pPr>
+      <w:r>
+        <w:t>Den dataansvarlige skal vurdere risiciene for fysiske personers rettigheder og frihedsrettigheder som behandlingen udgør og gennemføre foranstaltninger for at imødegå disse risici. Afhængig af deres relevans kan det omfatte:</w:t>
       </w:r>
     </w:p>
     <w:p>
@@ -2437,10 +2176,7 @@
       </w:pPr>
       <w:r>
         <w:lastRenderedPageBreak/>
-        <w:t>evne til at sikre vedvarende fortrolighed, integritet, tilgængelighed og robusthed af behandlingssyst</w:t>
-      </w:r>
-      <w:r>
-        <w:t>emer og -tjenester</w:t>
+        <w:t>evne til at sikre vedvarende fortrolighed, integritet, tilgængelighed og robusthed af behandlingssystemer og -tjenester</w:t>
       </w:r>
     </w:p>
     <w:p>
@@ -2481,10 +2217,7 @@
         <w:jc w:val="both"/>
       </w:pPr>
       <w:r>
-        <w:t>en procedure for regelmæssig afprøvning, vurdering og evaluering af effektiviteten af de tekniske og organisatoriske foranstaltninger til s</w:t>
-      </w:r>
-      <w:r>
-        <w:t>ikring af behandlingssikkerhed.</w:t>
+        <w:t>en procedure for regelmæssig afprøvning, vurdering og evaluering af effektiviteten af de tekniske og organisatoriske foranstaltninger til sikring af behandlingssikkerhed.</w:t>
       </w:r>
     </w:p>
     <w:p>
@@ -2504,40 +2237,10 @@
         <w:jc w:val="both"/>
       </w:pPr>
       <w:r>
-        <w:t>Efter forordningens artikel 32 skal databehandleren</w:t>
-      </w:r>
-      <w:r>
-        <w:t xml:space="preserve"> </w:t>
-      </w:r>
-      <w:r>
-        <w:t xml:space="preserve">– uafhængigt af den dataansvarlige – </w:t>
-      </w:r>
-      <w:r>
-        <w:t xml:space="preserve">også </w:t>
-      </w:r>
-      <w:r>
-        <w:t xml:space="preserve">vurdere risiciene for fysiske personers rettigheder </w:t>
-      </w:r>
-      <w:r>
-        <w:t>som behandling</w:t>
-      </w:r>
-      <w:r>
-        <w:t>en</w:t>
-      </w:r>
-      <w:r>
-        <w:t xml:space="preserve"> udgør og gennemføre foranstaltninger for at </w:t>
-      </w:r>
-      <w:r>
-        <w:t xml:space="preserve">imødegå </w:t>
-      </w:r>
-      <w:r>
-        <w:t xml:space="preserve">disse risici. Med henblik på denne vurdering skal den dataansvarlige stille den nødvendige information til rådighed for databehandleren som gør </w:t>
-      </w:r>
-      <w:r>
-        <w:t xml:space="preserve">vedkommende </w:t>
-      </w:r>
-      <w:r>
-        <w:t>i stand til at identificere og vurdere sådanne risici.</w:t>
+        <w:t xml:space="preserve">Efter forordningens artikel 32 skal databehandleren – uafhængigt af den dataansvarlige – også vurdere risiciene for fysiske personers rettigheder som behandlingen udgør og gennemføre foranstaltninger for at imødegå </w:t>
+      </w:r>
+      <w:r>
+        <w:t>disse risici. Med henblik på denne vurdering skal den dataansvarlige stille den nødvendige information til rådighed for databehandleren som gør vedkommende i stand til at identificere og vurdere sådanne risici.</w:t>
       </w:r>
     </w:p>
     <w:p>
@@ -2556,42 +2259,24 @@
         <w:jc w:val="both"/>
       </w:pPr>
       <w:r>
-        <w:t xml:space="preserve">Derudover skal databehandleren bistå den dataansvarlige med </w:t>
-      </w:r>
-      <w:r>
-        <w:t>vedkommendes</w:t>
-      </w:r>
-      <w:r>
-        <w:t xml:space="preserve"> overholdelse af den dataansvarliges forpligtelse efter forordningens artikel 32, ved bl.a. at stille den nødvendige information til rådighed for den dataansvarlige vedrørende de tekniske og organisatoriske sikkerhedsforanstaltninger, som databehandleren allerede har </w:t>
-      </w:r>
-      <w:r>
-        <w:t xml:space="preserve">gennemført </w:t>
-      </w:r>
-      <w:r>
-        <w:t>i henhold til forordningens artikel 32</w:t>
-      </w:r>
-      <w:r>
-        <w:t xml:space="preserve">, og </w:t>
-      </w:r>
-      <w:r>
-        <w:t>al anden information, der er nødvendig for den dataansvarliges overholdelse af sin forpligtelse efter forordningens artikel 32.</w:t>
-      </w:r>
-    </w:p>
-    <w:p>
-      <w:pPr>
-        <w:pStyle w:val="Listeafsnit"/>
-      </w:pPr>
-    </w:p>
-    <w:p>
-      <w:pPr>
-        <w:pStyle w:val="Listeafsnit"/>
-        <w:jc w:val="both"/>
-      </w:pPr>
-      <w:r>
-        <w:t xml:space="preserve">Hvis </w:t>
-      </w:r>
-      <w:r>
-        <w:t xml:space="preserve">imødegåelse </w:t>
+        <w:t>Derudover skal databehandleren bistå den dataansvarlige med vedkommendes</w:t>
+      </w:r>
+      <w:r>
+        <w:t xml:space="preserve"> overholdelse af den dataansvarliges forpligtelse efter forordningens artikel 32, ved bl.a. at stille den nødvendige information til rådighed for den dataansvarlige vedrørende de tekniske og organisatoriske sikkerhedsforanstaltninger, som databehandleren allerede har gennemført i henhold til forordningens artikel 32, og al anden information, der er nødvendig for den dataansvarliges overholdelse af sin forpligtelse efter forordningens artikel 32.</w:t>
+      </w:r>
+    </w:p>
+    <w:p>
+      <w:pPr>
+        <w:pStyle w:val="Listeafsnit"/>
+      </w:pPr>
+    </w:p>
+    <w:p>
+      <w:pPr>
+        <w:pStyle w:val="Listeafsnit"/>
+        <w:jc w:val="both"/>
+      </w:pPr>
+      <w:r>
+        <w:t xml:space="preserve">Hvis imødegåelse </w:t>
       </w:r>
       <w:r>
         <w:t>af de identificerede risici – efter den dataansvarliges vurdering – kræver gennemførelse af yderligere foranstaltninger end de foranstaltninger, som databehandleren allerede har gennemført, skal den dataansvarlige angive de yderligere foranstaltninger, der skal gennemføres, i bilag C.</w:t>
@@ -2601,7 +2286,7 @@
       <w:pPr>
         <w:pStyle w:val="Overskrift1"/>
       </w:pPr>
-      <w:bookmarkStart w:id="5" w:name="_Toc237035743"/>
+      <w:bookmarkStart w:id="5" w:name="_Toc237039925"/>
       <w:r>
         <w:t>Anvendelse af underdatabehandlere</w:t>
       </w:r>
@@ -2618,10 +2303,7 @@
         <w:jc w:val="both"/>
       </w:pPr>
       <w:r>
-        <w:t xml:space="preserve">Databehandleren skal opfylde </w:t>
-      </w:r>
-      <w:r>
-        <w:t xml:space="preserve">de betingelser, der er omhandlet </w:t>
+        <w:t xml:space="preserve">Databehandleren skal opfylde de betingelser, der er omhandlet </w:t>
       </w:r>
       <w:r>
         <w:t>i databeskyttelsesforordningens artikel 28, stk. 2, og stk. 4, for at gøre brug af en anden databehandler (en underdatabehandler).</w:t>
@@ -2690,47 +2372,32 @@
         <w:jc w:val="both"/>
       </w:pPr>
       <w:r>
-        <w:t xml:space="preserve">Når databehandleren gør brug af en underdatabehandler </w:t>
-      </w:r>
-      <w:r>
-        <w:t>i forbindelse med udførelse af</w:t>
+        <w:t>Når databehandleren gør brug af en underdatabehandler i forbindelse med udførelse af</w:t>
       </w:r>
       <w:r>
         <w:t xml:space="preserve"> specifikke behandlingsaktiviteter på vegne af den dataansvarlige, skal databehandleren, gennem en kontrakt eller andet retligt dokument i henhold til EU-retten eller </w:t>
       </w:r>
       <w:r>
         <w:lastRenderedPageBreak/>
-        <w:t xml:space="preserve">medlemsstaternes nationale ret, pålægge underdatabehandleren de samme databeskyttelsesforpligtelser som </w:t>
-      </w:r>
-      <w:r>
-        <w:t xml:space="preserve">dem, der </w:t>
-      </w:r>
-      <w:r>
-        <w:t>fremgår af disse Bestemmelser, hvorved der navnlig stilles de fornødne garantier for, at underdatabehandleren vil gennemføre de tekniske og organisatoriske foranstaltninger på en sådan måde, at behandlingen overholder kravene i disse Bestemmelser</w:t>
-      </w:r>
-      <w:r>
-        <w:t xml:space="preserve"> og databeskyttelsesforordningen.</w:t>
-      </w:r>
-    </w:p>
-    <w:p>
-      <w:pPr>
-        <w:pStyle w:val="Listeafsnit"/>
-        <w:jc w:val="both"/>
-      </w:pPr>
-    </w:p>
-    <w:p>
-      <w:pPr>
-        <w:pStyle w:val="Listeafsnit"/>
-        <w:jc w:val="both"/>
-      </w:pPr>
-      <w:r>
-        <w:t xml:space="preserve">Databehandleren </w:t>
-      </w:r>
-      <w:r>
-        <w:t xml:space="preserve">er derfor ansvarlig for at kræve, at underdatabehandleren som minimum overholder databehandlerens forpligtelser efter disse Bestemmelser og </w:t>
-      </w:r>
-      <w:r>
-        <w:t>databeskyttelsesforordningen.</w:t>
+        <w:t xml:space="preserve">medlemsstaternes nationale ret, pålægge underdatabehandleren de samme databeskyttelsesforpligtelser som dem, der </w:t>
+      </w:r>
+      <w:r>
+        <w:t>fremgår af disse Bestemmelser, hvorved der navnlig stilles de fornødne garantier for, at underdatabehandleren vil gennemføre de tekniske og organisatoriske foranstaltninger på en sådan måde, at behandlingen overholder kravene i disse Bestemmelser og databeskyttelsesforordningen.</w:t>
+      </w:r>
+    </w:p>
+    <w:p>
+      <w:pPr>
+        <w:pStyle w:val="Listeafsnit"/>
+        <w:jc w:val="both"/>
+      </w:pPr>
+    </w:p>
+    <w:p>
+      <w:pPr>
+        <w:pStyle w:val="Listeafsnit"/>
+        <w:jc w:val="both"/>
+      </w:pPr>
+      <w:r>
+        <w:t>Databehandleren er derfor ansvarlig for at kræve, at underdatabehandleren som minimum overholder databehandlerens forpligtelser efter disse Bestemmelser og databeskyttelsesforordningen.</w:t>
       </w:r>
     </w:p>
     <w:p>
@@ -2752,13 +2419,7 @@
         <w:t>Underdatabehandleraftale(r)</w:t>
       </w:r>
       <w:r>
-        <w:t xml:space="preserve"> og eventuelle senere ændringer hertil sendes – efter den dataansvarliges anmodning herom – i kopi til den dataansvarlige, som herigennem </w:t>
-      </w:r>
-      <w:r>
-        <w:t xml:space="preserve">har mulighed for at </w:t>
-      </w:r>
-      <w:r>
-        <w:t>sikre sig, at tilsvarende databeskyttelsesforpligtelser som følger af disse Bestemmelser er pålagt underdatabehandleren. Bestemmelser om kommercielle vilkår, som ikke påvirker det databeskyttelsesretlige indhold af underdatabehandleraftalen, skal ikke sendes til den dataansvarlige.</w:t>
+        <w:t xml:space="preserve"> og eventuelle senere ændringer hertil sendes – efter den dataansvarliges anmodning herom – i kopi til den dataansvarlige, som herigennem har mulighed for at sikre sig, at tilsvarende databeskyttelsesforpligtelser som følger af disse Bestemmelser er pålagt underdatabehandleren. Bestemmelser om kommercielle vilkår, som ikke påvirker det databeskyttelsesretlige indhold af underdatabehandleraftalen, skal ikke sendes til den dataansvarlige.</w:t>
       </w:r>
     </w:p>
     <w:p>
@@ -2787,10 +2448,7 @@
         <w:jc w:val="both"/>
       </w:pPr>
       <w:r>
-        <w:t xml:space="preserve">Hvis </w:t>
-      </w:r>
-      <w:r>
-        <w:t>under</w:t>
+        <w:t>Hvis under</w:t>
       </w:r>
       <w:r>
         <w:t xml:space="preserve">databehandleren ikke opfylder sine databeskyttelsesforpligtelser, forbliver databehandleren fuldt ansvarlig over for den dataansvarlige for opfyldelsen af underdatabehandlerens forpligtelser. Dette påvirker ikke de registreredes rettigheder, der følger af databeskyttelsesforordningen, herunder særligt forordningens artikel 79 og 82, over for den dataansvarlige og databehandleren, herunder underdatabehandleren. </w:t>
@@ -2800,7 +2458,7 @@
       <w:pPr>
         <w:pStyle w:val="Overskrift1"/>
       </w:pPr>
-      <w:bookmarkStart w:id="6" w:name="_Toc237035744"/>
+      <w:bookmarkStart w:id="6" w:name="_Toc237039926"/>
       <w:r>
         <w:t>Overførsel til tredjelande eller internationale organisationer</w:t>
       </w:r>
@@ -2836,13 +2494,7 @@
         <w:jc w:val="both"/>
       </w:pPr>
       <w:r>
-        <w:t xml:space="preserve">Hvis </w:t>
-      </w:r>
-      <w:r>
-        <w:t>overførsel af personoplysninger til tredjelande eller internationale organisationer, som databehandleren ikke er blevet instrueret i at foretage af den dataansvarlige</w:t>
-      </w:r>
-      <w:r>
-        <w:t>, kræves i henhold til EU-ret</w:t>
+        <w:t>Hvis overførsel af personoplysninger til tredjelande eller internationale organisationer, som databehandleren ikke er blevet instrueret i at foretage af den dataansvarlige, kræves i henhold til EU-ret</w:t>
       </w:r>
       <w:r>
         <w:t xml:space="preserve"> eller medlemsstaternes nationale ret, som databehandleren er underlagt, skal databehandleren underrette den dataansvarlige om dette retlige krav inden behandling, medmindre den pågældende ret forbyder en sådan underretning af hensyn til vigtige samfundsmæssige interesser.</w:t>
@@ -2907,13 +2559,7 @@
         <w:jc w:val="both"/>
       </w:pPr>
       <w:r>
-        <w:t xml:space="preserve">behandle </w:t>
-      </w:r>
-      <w:r>
-        <w:t>person</w:t>
-      </w:r>
-      <w:r>
-        <w:t>oplysningerne i et tredjeland</w:t>
+        <w:t>behandle personoplysningerne i et tredjeland</w:t>
       </w:r>
     </w:p>
     <w:p>
@@ -2933,19 +2579,7 @@
         <w:jc w:val="both"/>
       </w:pPr>
       <w:r>
-        <w:t>Den dataansvarliges instruks vedrørende overførsel af personoplysninger til et tredjeland, herunder</w:t>
-      </w:r>
-      <w:r>
-        <w:t xml:space="preserve"> det eventuelle overførselsgrundlag</w:t>
-      </w:r>
-      <w:r>
-        <w:t xml:space="preserve"> i databeskyttelsesforordningens kapitel V, som overførslen er baseret på, skal angives i </w:t>
-      </w:r>
-      <w:r>
-        <w:t>b</w:t>
-      </w:r>
-      <w:r>
-        <w:t>ilag C.6.</w:t>
+        <w:t>Den dataansvarliges instruks vedrørende overførsel af personoplysninger til et tredjeland, herunder det eventuelle overførselsgrundlag i databeskyttelsesforordningens kapitel V, som overførslen er baseret på, skal angives i bilag C.6.</w:t>
       </w:r>
     </w:p>
     <w:p>
@@ -2965,23 +2599,14 @@
       </w:pPr>
       <w:r>
         <w:lastRenderedPageBreak/>
-        <w:t>Disse Bestemmelser skal ikke forveksles med standardkontraktsbestemmelser som omhandlet i databeskyttelsesforordningens artikel 46, stk. 2, litra c og d, og disse Bestemmelser kan ikke udgør</w:t>
-      </w:r>
-      <w:r>
-        <w:t>e</w:t>
-      </w:r>
-      <w:r>
-        <w:t xml:space="preserve"> et grundlag for ov</w:t>
-      </w:r>
-      <w:r>
-        <w:t>erførsel af personoplysninger som omhandlet i databeskyttelsesforordningens kapitel V.</w:t>
+        <w:t>Disse Bestemmelser skal ikke forveksles med standardkontraktsbestemmelser som omhandlet i databeskyttelsesforordningens artikel 46, stk. 2, litra c og d, og disse Bestemmelser kan ikke udgøre et grundlag for overførsel af personoplysninger som omhandlet i databeskyttelsesforordningens kapitel V.</w:t>
       </w:r>
     </w:p>
     <w:p>
       <w:pPr>
         <w:pStyle w:val="Overskrift1"/>
       </w:pPr>
-      <w:bookmarkStart w:id="7" w:name="_Toc237035745"/>
+      <w:bookmarkStart w:id="7" w:name="_Toc237039927"/>
       <w:r>
         <w:t>Bistand til den dataansvarlige</w:t>
       </w:r>
@@ -2998,41 +2623,23 @@
         <w:jc w:val="both"/>
       </w:pPr>
       <w:r>
-        <w:t>Databehandleren bistår, u</w:t>
-      </w:r>
-      <w:r>
-        <w:t xml:space="preserve">nder hensyntagen til behandlingens karakter, </w:t>
-      </w:r>
-      <w:r>
-        <w:t xml:space="preserve">så vidt muligt </w:t>
-      </w:r>
-      <w:r>
-        <w:t xml:space="preserve">den dataansvarlige ved hjælp af passende tekniske og organisatoriske foranstaltninger med opfyldelse af den dataansvarliges forpligtelse til at besvare anmodninger om udøvelsen af de registreredes rettigheder som fastlagt i </w:t>
-      </w:r>
-      <w:r>
-        <w:t xml:space="preserve">databeskyttelsesforordningens </w:t>
-      </w:r>
-      <w:r>
-        <w:t>kapitel III.</w:t>
-      </w:r>
-    </w:p>
-    <w:p>
-      <w:pPr>
-        <w:pStyle w:val="Listeafsnit"/>
-      </w:pPr>
-    </w:p>
-    <w:p>
-      <w:pPr>
-        <w:pStyle w:val="Listeafsnit"/>
-      </w:pPr>
-      <w:r>
-        <w:t>Dette indebærer, at databehandleren så vidt mulig</w:t>
-      </w:r>
-      <w:r>
-        <w:t xml:space="preserve">t skal bistå den dataansvarlige i forbindelse med, at den dataansvarlige skal sikre overholdelsen </w:t>
-      </w:r>
-      <w:r>
-        <w:t>af:</w:t>
+        <w:t xml:space="preserve">Databehandleren bistår, under hensyntagen til behandlingens karakter, så vidt muligt </w:t>
+      </w:r>
+      <w:r>
+        <w:t>den dataansvarlige ved hjælp af passende tekniske og organisatoriske foranstaltninger med opfyldelse af den dataansvarliges forpligtelse til at besvare anmodninger om udøvelsen af de registreredes rettigheder som fastlagt i databeskyttelsesforordningens kapitel III.</w:t>
+      </w:r>
+    </w:p>
+    <w:p>
+      <w:pPr>
+        <w:pStyle w:val="Listeafsnit"/>
+      </w:pPr>
+    </w:p>
+    <w:p>
+      <w:pPr>
+        <w:pStyle w:val="Listeafsnit"/>
+      </w:pPr>
+      <w:r>
+        <w:t>Dette indebærer, at databehandleren så vidt muligt skal bistå den dataansvarlige i forbindelse med, at den dataansvarlige skal sikre overholdelsen af:</w:t>
       </w:r>
     </w:p>
     <w:p>
@@ -3178,34 +2785,7 @@
         <w:t>I tillæg til</w:t>
       </w:r>
       <w:r>
-        <w:t xml:space="preserve"> databehandlerens forpligtelse til at bistå den dataansvarlige i henhold til Bestemmelse 6.</w:t>
-      </w:r>
-      <w:r>
-        <w:t>3</w:t>
-      </w:r>
-      <w:r>
-        <w:t>.</w:t>
-      </w:r>
-      <w:r>
-        <w:t xml:space="preserve">, </w:t>
-      </w:r>
-      <w:r>
-        <w:t xml:space="preserve">bistår </w:t>
-      </w:r>
-      <w:r>
-        <w:t>databehandlere</w:t>
-      </w:r>
-      <w:r>
-        <w:t>n</w:t>
-      </w:r>
-      <w:r>
-        <w:t xml:space="preserve"> endvidere, under hensyntagen til behandlingens karakter og de oplysninger, der er ti</w:t>
-      </w:r>
-      <w:r>
-        <w:t xml:space="preserve">lgængelige for databehandleren, </w:t>
-      </w:r>
-      <w:r>
-        <w:t>den dataansvarlige med:</w:t>
+        <w:t xml:space="preserve"> databehandlerens forpligtelse til at bistå den dataansvarlige i henhold til Bestemmelse 6.3., bistår databehandleren endvidere, under hensyntagen til behandlingens karakter og de oplysninger, der er tilgængelige for databehandleren, den dataansvarlige med:</w:t>
       </w:r>
     </w:p>
     <w:p>
@@ -3267,13 +2847,7 @@
         <w:jc w:val="both"/>
       </w:pPr>
       <w:r>
-        <w:t xml:space="preserve">den dataansvarliges forpligtelse til </w:t>
-      </w:r>
-      <w:r>
-        <w:t xml:space="preserve">forud for behandlingen </w:t>
-      </w:r>
-      <w:r>
-        <w:t>at foretage en analyse af de påtænkte behandlingsaktiviteters konsekvenser for beskyttelse af personoplysninger (en konsekvensanalyse)</w:t>
+        <w:t>den dataansvarliges forpligtelse til forud for behandlingen at foretage en analyse af de påtænkte behandlingsaktiviteters konsekvenser for beskyttelse af personoplysninger (en konsekvensanalyse)</w:t>
       </w:r>
     </w:p>
     <w:p>
@@ -3314,22 +2888,7 @@
         <w:jc w:val="both"/>
       </w:pPr>
       <w:r>
-        <w:t xml:space="preserve">Parterne skal </w:t>
-      </w:r>
-      <w:r>
-        <w:t xml:space="preserve">i bilag C </w:t>
-      </w:r>
-      <w:r>
-        <w:t>angive de fornødne tekniske og organisatoriske foranstaltninger, hvormed databehandlere</w:t>
-      </w:r>
-      <w:r>
-        <w:t>n skal bistå den dataansvarlige</w:t>
-      </w:r>
-      <w:r>
-        <w:t xml:space="preserve"> samt i hvilket omfang og udstrækning. Det gælder for de forpligtelser, der følger af Bestemmelse 9.1</w:t>
-      </w:r>
-      <w:r>
-        <w:t>.</w:t>
+        <w:t>Parterne skal i bilag C angive de fornødne tekniske og organisatoriske foranstaltninger, hvormed databehandleren skal bistå den dataansvarlige samt i hvilket omfang og udstrækning. Det gælder for de forpligtelser, der følger af Bestemmelse 9.1.</w:t>
       </w:r>
       <w:r>
         <w:t xml:space="preserve"> og 9.2.</w:t>
@@ -3339,7 +2898,7 @@
       <w:pPr>
         <w:pStyle w:val="Overskrift1"/>
       </w:pPr>
-      <w:bookmarkStart w:id="8" w:name="_Toc237035746"/>
+      <w:bookmarkStart w:id="8" w:name="_Toc237039928"/>
       <w:r>
         <w:t>Underretning om brud på persondatasikkerheden</w:t>
       </w:r>
@@ -3394,13 +2953,7 @@
         <w:jc w:val="both"/>
       </w:pPr>
       <w:r>
-        <w:t xml:space="preserve">I overensstemmelse med Bestemmelse 9.2.a skal databehandleren bistå den dataansvarlige med at foretage anmeldelse af bruddet til den kompetente tilsynsmyndighed. Det betyder, at databehandleren skal bistå </w:t>
-      </w:r>
-      <w:r>
-        <w:t>med</w:t>
-      </w:r>
-      <w:r>
-        <w:t xml:space="preserve"> at tilvejebringe nedenstående information, som ifølge artikel 33, stk. 3, skal fremgå af den dataansvarliges anmeldelse af bruddet til den kompetente tilsynsmyndighed:</w:t>
+        <w:t>I overensstemmelse med Bestemmelse 9.2.a skal databehandleren bistå den dataansvarlige med at foretage anmeldelse af bruddet til den kompetente tilsynsmyndighed. Det betyder, at databehandleren skal bistå med at tilvejebringe nedenstående information, som ifølge artikel 33, stk. 3, skal fremgå af den dataansvarliges anmeldelse af bruddet til den kompetente tilsynsmyndighed:</w:t>
       </w:r>
     </w:p>
     <w:p>
@@ -3459,10 +3012,7 @@
         <w:jc w:val="both"/>
       </w:pPr>
       <w:r>
-        <w:t>de foranstaltninger, som den dataansvarlige har truffet eller foreslår truffet for at håndtere bruddet på persondatasikkerheden, herunder, hvis det er relevant, foranstaltninger for at begrænse dets mulige skadevirkninger</w:t>
-      </w:r>
-      <w:r>
-        <w:t>.</w:t>
+        <w:t>de foranstaltninger, som den dataansvarlige har truffet eller foreslår truffet for at håndtere bruddet på persondatasikkerheden, herunder, hvis det er relevant, foranstaltninger for at begrænse dets mulige skadevirkninger.</w:t>
       </w:r>
     </w:p>
     <w:p>
@@ -3480,23 +3030,14 @@
         <w:jc w:val="both"/>
       </w:pPr>
       <w:r>
-        <w:t xml:space="preserve">Parterne skal i </w:t>
-      </w:r>
-      <w:r>
-        <w:t>b</w:t>
-      </w:r>
-      <w:r>
-        <w:t>ilag C</w:t>
-      </w:r>
-      <w:r>
-        <w:t xml:space="preserve"> angive den information, som databehandleren skal tilvejebringe i forbindelse med sin bistand til den dataansvarlige i dennes forpligtelse til at anmelde brud på persondatasikkerheden til den kompetente tilsynsmyndighed.</w:t>
+        <w:t>Parterne skal i bilag C angive den information, som databehandleren skal tilvejebringe i forbindelse med sin bistand til den dataansvarlige i dennes forpligtelse til at anmelde brud på persondatasikkerheden til den kompetente tilsynsmyndighed.</w:t>
       </w:r>
     </w:p>
     <w:p>
       <w:pPr>
         <w:pStyle w:val="Overskrift1"/>
       </w:pPr>
-      <w:bookmarkStart w:id="9" w:name="_Toc237035747"/>
+      <w:bookmarkStart w:id="9" w:name="_Toc237039929"/>
       <w:r>
         <w:t>Sletning og returnering af oplysninger</w:t>
       </w:r>
@@ -3557,16 +3098,10 @@
       <w:pPr>
         <w:pStyle w:val="Overskrift1"/>
       </w:pPr>
-      <w:bookmarkStart w:id="10" w:name="_Toc237035748"/>
+      <w:bookmarkStart w:id="10" w:name="_Toc237039930"/>
       <w:r>
         <w:lastRenderedPageBreak/>
-        <w:t>R</w:t>
-      </w:r>
-      <w:r>
-        <w:t>evision</w:t>
-      </w:r>
-      <w:r>
-        <w:t>, herunder inspektion</w:t>
+        <w:t>Revision, herunder inspektion</w:t>
       </w:r>
       <w:bookmarkEnd w:id="10"/>
     </w:p>
@@ -3584,31 +3119,7 @@
         <w:t>Databehandleren stiller al</w:t>
       </w:r>
       <w:r>
-        <w:t>le</w:t>
-      </w:r>
-      <w:r>
-        <w:t xml:space="preserve"> </w:t>
-      </w:r>
-      <w:r>
-        <w:t>oplysninger</w:t>
-      </w:r>
-      <w:r>
-        <w:t>, der er nødvendig</w:t>
-      </w:r>
-      <w:r>
-        <w:t>e</w:t>
-      </w:r>
-      <w:r>
-        <w:t xml:space="preserve"> </w:t>
-      </w:r>
-      <w:r>
-        <w:t xml:space="preserve">for at påvise overholdelsen af </w:t>
-      </w:r>
-      <w:r>
-        <w:t>databeskyttelses</w:t>
-      </w:r>
-      <w:r>
-        <w:t>forordningens artikel 28 og disse Bestemmelser, til rådighed for den dataansvarlige og giver mulighed for og bidrager til revisioner, herunder inspektioner, der foretages af den dataansvarlige eller en anden revisor, som er bemyndiget af den dataansvarlige.</w:t>
+        <w:t>le oplysninger, der er nødvendige for at påvise overholdelsen af databeskyttelsesforordningens artikel 28 og disse Bestemmelser, til rådighed for den dataansvarlige og giver mulighed for og bidrager til revisioner, herunder inspektioner, der foretages af den dataansvarlige eller en anden revisor, som er bemyndiget af den dataansvarlige.</w:t>
       </w:r>
     </w:p>
     <w:p>
@@ -3627,28 +3138,7 @@
         <w:jc w:val="both"/>
       </w:pPr>
       <w:r>
-        <w:t xml:space="preserve">Procedurerne for den dataansvarliges </w:t>
-      </w:r>
-      <w:r>
-        <w:t>revisioner</w:t>
-      </w:r>
-      <w:r>
-        <w:t>, herunder inspektioner, med databehandleren og underdatabehandlere</w:t>
-      </w:r>
-      <w:r>
-        <w:t xml:space="preserve"> er nærmeret angivet i Bilag C.7</w:t>
-      </w:r>
-      <w:r>
-        <w:t>.</w:t>
-      </w:r>
-      <w:r>
-        <w:t xml:space="preserve"> og C.</w:t>
-      </w:r>
-      <w:r>
-        <w:t>8</w:t>
-      </w:r>
-      <w:r>
-        <w:t>.</w:t>
+        <w:t>Procedurerne for den dataansvarliges revisioner, herunder inspektioner, med databehandleren og underdatabehandlere er nærmeret angivet i Bilag C.7. og C.8.</w:t>
       </w:r>
     </w:p>
     <w:p>
@@ -3673,7 +3163,7 @@
       <w:pPr>
         <w:pStyle w:val="Overskrift1"/>
       </w:pPr>
-      <w:bookmarkStart w:id="11" w:name="_Toc237035749"/>
+      <w:bookmarkStart w:id="11" w:name="_Toc237039931"/>
       <w:r>
         <w:t>Parternes aftale om andre forhold</w:t>
       </w:r>
@@ -3690,16 +3180,7 @@
         <w:jc w:val="both"/>
       </w:pPr>
       <w:r>
-        <w:t>Parterne kan aftale andre bestemmelser vedrørende tjeneste</w:t>
-      </w:r>
-      <w:r>
-        <w:t>n</w:t>
-      </w:r>
-      <w:r>
-        <w:t xml:space="preserve"> vedrørende behandling af personoplysninger </w:t>
-      </w:r>
-      <w:r>
-        <w:t>om</w:t>
+        <w:t>Parterne kan aftale andre bestemmelser vedrørende tjenesten vedrørende behandling af personoplysninger om</w:t>
       </w:r>
       <w:r>
         <w:t xml:space="preserve"> f.eks. erstatningsansvar, så længe disse andre bestemmelser ikke direkte eller indirekte strider imod Bestemmelserne eller forringer den registreredes grundlæggende rettigheder og frihedsrettigheder, som følger af databeskyttelsesforordningen.</w:t>
@@ -3709,7 +3190,7 @@
       <w:pPr>
         <w:pStyle w:val="Overskrift1"/>
       </w:pPr>
-      <w:bookmarkStart w:id="12" w:name="_Toc237035750"/>
+      <w:bookmarkStart w:id="12" w:name="_Toc237039932"/>
       <w:r>
         <w:t>Ikrafttræden og ophør</w:t>
       </w:r>
@@ -3745,10 +3226,7 @@
         <w:jc w:val="both"/>
       </w:pPr>
       <w:r>
-        <w:t xml:space="preserve">Begge parter kan kræve Bestemmelserne genforhandlet, hvis lovændringer eller uhensigtsmæssigheder i Bestemmelserne </w:t>
-      </w:r>
-      <w:r>
-        <w:t>giver anledning hertil.</w:t>
+        <w:t>Begge parter kan kræve Bestemmelserne genforhandlet, hvis lovændringer eller uhensigtsmæssigheder i Bestemmelserne giver anledning hertil.</w:t>
       </w:r>
     </w:p>
     <w:p>
@@ -3770,16 +3248,7 @@
         <w:t>Bestemmelserne e</w:t>
       </w:r>
       <w:r>
-        <w:t>r gældende, så længe tjenesten</w:t>
-      </w:r>
-      <w:r>
-        <w:t xml:space="preserve"> vedrørende behandling af personoplysninger varer. I denne periode kan Bestemmelserne ikke opsiges, medmindre andre bestemmelser, der regulerer levering af</w:t>
-      </w:r>
-      <w:r>
-        <w:t xml:space="preserve"> tjenesten</w:t>
-      </w:r>
-      <w:r>
-        <w:t xml:space="preserve"> vedrørende behandling af personoplysninger, aftales mellem parterne.</w:t>
+        <w:t>r gældende, så længe tjenesten vedrørende behandling af personoplysninger varer. I denne periode kan Bestemmelserne ikke opsiges, medmindre andre bestemmelser, der regulerer levering af tjenesten vedrørende behandling af personoplysninger, aftales mellem parterne.</w:t>
       </w:r>
     </w:p>
     <w:p>
@@ -3896,10 +3365,7 @@
         <w:jc w:val="both"/>
       </w:pPr>
       <w:r>
-        <w:t>På vegne af data</w:t>
-      </w:r>
-      <w:r>
-        <w:t>behandleren</w:t>
+        <w:t>På vegne af databehandleren</w:t>
       </w:r>
     </w:p>
     <w:p>
@@ -3958,7 +3424,7 @@
       <w:pPr>
         <w:pStyle w:val="Overskrift1"/>
       </w:pPr>
-      <w:bookmarkStart w:id="13" w:name="_Toc237035751"/>
+      <w:bookmarkStart w:id="13" w:name="_Toc237039933"/>
       <w:r>
         <w:t>Kontaktpersoner hos den dataansvarlige og databehandleren</w:t>
       </w:r>
@@ -3974,13 +3440,7 @@
         </w:numPr>
       </w:pPr>
       <w:r>
-        <w:t xml:space="preserve">Parterne kan kontakte hinanden </w:t>
-      </w:r>
-      <w:r>
-        <w:t>via</w:t>
-      </w:r>
-      <w:r>
-        <w:t xml:space="preserve"> nedenstående kontaktpersoner.</w:t>
+        <w:t>Parterne kan kontakte hinanden via nedenstående kontaktpersoner.</w:t>
       </w:r>
     </w:p>
     <w:p>
@@ -4099,7 +3559,7 @@
           <w:numId w:val="0"/>
         </w:numPr>
       </w:pPr>
-      <w:bookmarkStart w:id="14" w:name="_Toc237035752"/>
+      <w:bookmarkStart w:id="14" w:name="_Toc237039934"/>
       <w:r>
         <w:lastRenderedPageBreak/>
         <w:t>Bilag A</w:t>
@@ -4121,69 +3581,39 @@
         <w:rPr>
           <w:b/>
         </w:rPr>
-        <w:t>A.1</w:t>
-      </w:r>
-      <w:r>
+        <w:t>A.1. Formålet med databehandlerens behandling af personoplysninger på vegne af den dataansvarlige</w:t>
+      </w:r>
+    </w:p>
+    <w:p>
+      <w:pPr>
+        <w:jc w:val="both"/>
+      </w:pPr>
+    </w:p>
+    <w:p>
+      <w:pPr>
+        <w:jc w:val="both"/>
+      </w:pPr>
+      <w:r>
+        <w:t>Formålet er at stille SkoleGPS.dk til rådighed for den dataansvarliges lærere og undervisningskonsulenter, så de kan oprette, dele, starte og gennemføre stedbaserede undervisningsløb, lade elever deltage uden elevkonto, vise opgaver og aktuelle poster, modtage besvarelser og eventuelle fotos samt give læreren status og resultater. Behandlingen må ikke anvendes til reklame, videresalg af elevdata, profilering eller andre uforenelige formål.</w:t>
+      </w:r>
+    </w:p>
+    <w:p>
+      <w:pPr>
+        <w:jc w:val="both"/>
+      </w:pPr>
+    </w:p>
+    <w:p>
+      <w:pPr>
+        <w:jc w:val="both"/>
         <w:rPr>
           <w:b/>
         </w:rPr>
-        <w:t>.</w:t>
-      </w:r>
+      </w:pPr>
       <w:r>
         <w:rPr>
           <w:b/>
         </w:rPr>
-        <w:t xml:space="preserve"> </w:t>
-      </w:r>
-      <w:r>
-        <w:rPr>
-          <w:b/>
-        </w:rPr>
-        <w:t>Formålet med databehandlerens behandling af personoplysninger på vegne af den dataansvarlige</w:t>
-      </w:r>
-    </w:p>
-    <w:p>
-      <w:pPr>
-        <w:jc w:val="both"/>
-      </w:pPr>
-    </w:p>
-    <w:p>
-      <w:pPr>
-        <w:jc w:val="both"/>
-      </w:pPr>
-      <w:r>
-        <w:t>Formålet er at stille SkoleGPS.dk til rådighed for den dataansvarliges lærere og undervisningskonsulenter, så de kan oprette, dele, starte og gennemføre stedbaserede undervisningsløb, lade elever deltage uden elevkonto, vise opgaver og aktuelle poster, modtage besvarelser og eventuelle fotos samt give læreren status og resultater. Behandlingen må ikke anvendes til reklame, videresalg af elevdata, profilering eller andre uforenelige formål.</w:t>
-      </w:r>
-    </w:p>
-    <w:p>
-      <w:pPr>
-        <w:jc w:val="both"/>
-      </w:pPr>
-    </w:p>
-    <w:p>
-      <w:pPr>
-        <w:jc w:val="both"/>
-        <w:rPr>
-          <w:b/>
-        </w:rPr>
-      </w:pPr>
-      <w:r>
-        <w:rPr>
-          <w:b/>
-        </w:rPr>
-        <w:t>A.2</w:t>
-      </w:r>
-      <w:r>
-        <w:rPr>
-          <w:b/>
-        </w:rPr>
-        <w:t>.</w:t>
-      </w:r>
-      <w:r>
-        <w:rPr>
-          <w:b/>
-        </w:rPr>
-        <w:t xml:space="preserve"> </w:t>
+        <w:t xml:space="preserve">A.2. </w:t>
       </w:r>
       <w:r>
         <w:rPr>
@@ -4202,7 +3632,10 @@
         <w:jc w:val="both"/>
       </w:pPr>
       <w:r>
-        <w:t>Behandlingen omfatter indsamling, registrering, organisering, opbevaring, løbende opdatering, visning, begrænset videregivelse til godkendte underdatabehandlere, fejlsøgning, sletning og sikkerhedskopiering. Under et aktivt løb modtages elevens aktuelle GPS-position og overskrives løbende på deltagerposten. Der er ikke konstateret en særskilt positionshistorik for det normale løbsflow. Lærere kan dele et løb til afvikling; modtageren får en selvstændig kopi uden tidligere sessioner, deltagere, elevdata, resultater, PIN-koder eller live-status.</w:t>
+        <w:t>Behandlingen omfatter indsamling, registrering, organisering, opbevaring, løbende opdatering, visning, begrænset videregivelse til godkendte underdatabehandlere, fejlsøgning, sletning og sikkerhedskopiering. Under et aktivt løb modtages elevens aktuelle GPS-position og overskrives løbende på deltagerposten. Positionen nulstilles ved afslutning og skjules/slettes efter 15 minutters inaktivitet. Der opbygges ikke en særskilt positionshistorik for det normale løbsflow. Lærere kan dele et løb til afvikling; mod</w:t>
+      </w:r>
+      <w:r>
+        <w:t>tageren får en selvstændig kopi uden tidligere sessioner, deltagere, elevdata, resultater, PIN-koder eller live-status.</w:t>
       </w:r>
     </w:p>
     <w:p>
@@ -4224,51 +3657,78 @@
         <w:rPr>
           <w:b/>
         </w:rPr>
-        <w:t>A.3</w:t>
-      </w:r>
-      <w:r>
+        <w:t>A.3. Behandlingen omfatter følgende typer af personoplysninger om de registrerede</w:t>
+      </w:r>
+    </w:p>
+    <w:p>
+      <w:pPr>
+        <w:jc w:val="both"/>
+      </w:pPr>
+    </w:p>
+    <w:p>
+      <w:r>
+        <w:t>Almindelige personoplysninger:</w:t>
+      </w:r>
+      <w:r>
+        <w:br/>
+        <w:t>• Lærere/konsulenter: navn, e-mailadresse, bruger- og autentifikations-id, loginudbyder, kontostatus, oprettede undervisningsløb samt frivilligt samtykke til produktnyt.</w:t>
+      </w:r>
+      <w:r>
+        <w:br/>
+      </w:r>
+      <w:r>
+        <w:t>• Elever/deltagere: valgfrit fornavn eller holdnavn, pseudonyme sessions- og deltager-id'er, aktuel GPS-position (breddegrad, længdegrad og eventuel nøjagtighed) under aktivt løb, tidsstempler, svar, point, gennemførelsesstatus og foto ved fotoopgave.</w:t>
+      </w:r>
+      <w:r>
+        <w:br/>
+        <w:t>• Teknisk drift: IP-/netværksoplysninger hos drifts- og kortleverandører, browser, enhedstype, operativsystem, URL/sti uden hemmelige tokens, fejl- og driftsmetadata samt sikkerhedslog.</w:t>
+      </w:r>
+      <w:r>
+        <w:br/>
+      </w:r>
+      <w:r>
+        <w:t>Der skal ikke behandles CPR-numre, særlige kategorier efter artikel 9, oplysninger om strafbare forhold eller fortrolige elevsager. Genkendelige personer må ikke fotograferes.</w:t>
+      </w:r>
+    </w:p>
+    <w:p>
+      <w:pPr>
+        <w:jc w:val="both"/>
         <w:rPr>
           <w:b/>
         </w:rPr>
-        <w:t>.</w:t>
-      </w:r>
+      </w:pPr>
       <w:r>
         <w:rPr>
           <w:b/>
         </w:rPr>
-        <w:t xml:space="preserve"> </w:t>
-      </w:r>
-      <w:r>
+        <w:t>A.4. Behandlingen omfatter følgende kategorier af registrerede</w:t>
+      </w:r>
+    </w:p>
+    <w:p>
+      <w:pPr>
+        <w:jc w:val="both"/>
         <w:rPr>
           <w:b/>
         </w:rPr>
-        <w:t>Behandlingen omfatter følgende typer af personoplysninger om de registrerede</w:t>
-      </w:r>
-    </w:p>
-    <w:p>
-      <w:pPr>
-        <w:jc w:val="both"/>
-      </w:pPr>
-    </w:p>
-    <w:p>
-      <w:r>
-        <w:t>Almindelige personoplysninger:</w:t>
+      </w:pPr>
+    </w:p>
+    <w:p>
+      <w:r>
+        <w:t>• Elever og andre deltagere i undervisningsløb, typisk børn og unge.</w:t>
       </w:r>
       <w:r>
         <w:br/>
-        <w:t>• Lærere/konsulenter: navn, e-mailadresse, bruger- og autentifikations-id, loginudbyder, kontostatus, oprettede undervisningsløb samt frivilligt samtykke til produktnyt.</w:t>
+        <w:t>• Lærere, pædagoger, undervisningskonsulenter, skoleadministratorer og andre autoriserede medarbejdere hos den dataansvarlige.</w:t>
       </w:r>
       <w:r>
         <w:br/>
-        <w:t>• Elever/deltagere: valgfrit fornavn eller holdnavn, pseudonyme sessions- og deltager-id'er, aktuel GPS-position (breddegrad, længdegrad og eventuel nøjagtighed) under aktivt løb, tidsstempler, svar, point, gennemførelsesstatus og foto ved fotoopgave.</w:t>
+        <w:t>• Kontaktpersoner hos kommunen/skoleejeren.</w:t>
       </w:r>
       <w:r>
         <w:br/>
-        <w:t>• Teknisk drift: IP-/netværksoplysninger hos drifts- og kortleverandører, browser, enhedstype, operativsystem, URL/sti uden hemmelige tokens, fejl- og driftsmetadata samt sikkerhedslog.</w:t>
-      </w:r>
-      <w:r>
-        <w:br/>
-        <w:t>Der skal ikke behandles CPR-numre, særlige kategorier efter artikel 9, oplysninger om strafbare forhold eller fortrolige elevsager. Genkendelige personer må ikke fotograferes.</w:t>
+      </w:r>
+      <w:r>
+        <w:t>Forældre/værger er kun registrerede, hvis de selv kontakter support eller indgår i en konkret, dokumenteret aktivitet.</w:t>
       </w:r>
     </w:p>
     <w:p>
@@ -4278,94 +3738,19 @@
           <w:b/>
         </w:rPr>
       </w:pPr>
-      <w:r>
+    </w:p>
+    <w:p>
+      <w:pPr>
+        <w:jc w:val="both"/>
         <w:rPr>
           <w:b/>
         </w:rPr>
-        <w:t>A.4</w:t>
-      </w:r>
+      </w:pPr>
       <w:r>
         <w:rPr>
           <w:b/>
         </w:rPr>
-        <w:t>.</w:t>
-      </w:r>
-      <w:r>
-        <w:rPr>
-          <w:b/>
-        </w:rPr>
-        <w:t xml:space="preserve"> </w:t>
-      </w:r>
-      <w:r>
-        <w:rPr>
-          <w:b/>
-        </w:rPr>
-        <w:t>Behandlingen omfatter følgende kategorier af registrerede</w:t>
-      </w:r>
-    </w:p>
-    <w:p>
-      <w:pPr>
-        <w:jc w:val="both"/>
-        <w:rPr>
-          <w:b/>
-        </w:rPr>
-      </w:pPr>
-    </w:p>
-    <w:p>
-      <w:r>
-        <w:t>• Elever og andre deltagere i undervisningsløb, typisk børn og unge.</w:t>
-      </w:r>
-      <w:r>
-        <w:br/>
-        <w:t>• Lærere, pædagoger, undervisningskonsulenter, skoleadministratorer og andre autoriserede medarbejdere hos den dataansvarlige.</w:t>
-      </w:r>
-      <w:r>
-        <w:br/>
-        <w:t>• Kontaktpersoner hos kommunen/skoleejeren.</w:t>
-      </w:r>
-      <w:r>
-        <w:br/>
-        <w:t>Forældre/værger er kun registrerede, hvis de selv kontakter support eller indgår i en konkret, dokumenteret aktivitet.</w:t>
-      </w:r>
-    </w:p>
-    <w:p>
-      <w:pPr>
-        <w:jc w:val="both"/>
-        <w:rPr>
-          <w:b/>
-        </w:rPr>
-      </w:pPr>
-    </w:p>
-    <w:p>
-      <w:pPr>
-        <w:jc w:val="both"/>
-        <w:rPr>
-          <w:b/>
-        </w:rPr>
-      </w:pPr>
-      <w:r>
-        <w:rPr>
-          <w:b/>
-        </w:rPr>
-        <w:t>A.5</w:t>
-      </w:r>
-      <w:r>
-        <w:rPr>
-          <w:b/>
-        </w:rPr>
-        <w:t>.</w:t>
-      </w:r>
-      <w:r>
-        <w:rPr>
-          <w:b/>
-        </w:rPr>
-        <w:t xml:space="preserve"> </w:t>
-      </w:r>
-      <w:r>
-        <w:rPr>
-          <w:b/>
-        </w:rPr>
-        <w:t>Databehandlerens behandling af personoplysninger på vegne af den dataansvarlige kan påbegyndes efter disse Bestemmelsers ikrafttræden. Behandlingen har følgende varighed</w:t>
+        <w:t>A.5. Databehandlerens behandling af personoplysninger på vegne af den dataansvarlige kan påbegyndes efter disse Bestemmelsers ikrafttræden. Behandlingen har følgende varighed</w:t>
       </w:r>
     </w:p>
     <w:p>
@@ -4400,15 +3785,13 @@
           <w:numId w:val="0"/>
         </w:numPr>
       </w:pPr>
-      <w:bookmarkStart w:id="15" w:name="_Toc237035753"/>
+      <w:bookmarkStart w:id="15" w:name="_Toc237039935"/>
       <w:r>
         <w:lastRenderedPageBreak/>
         <w:t>Bilag B</w:t>
       </w:r>
       <w:r>
         <w:tab/>
-      </w:r>
-      <w:r>
         <w:t>Underdatabehandlere</w:t>
       </w:r>
       <w:bookmarkEnd w:id="15"/>
@@ -4424,19 +3807,7 @@
         <w:rPr>
           <w:b/>
         </w:rPr>
-        <w:t>B.1</w:t>
-      </w:r>
-      <w:r>
-        <w:rPr>
-          <w:b/>
-        </w:rPr>
-        <w:t>.</w:t>
-      </w:r>
-      <w:r>
-        <w:rPr>
-          <w:b/>
-        </w:rPr>
-        <w:t xml:space="preserve"> Godkendte underdatabehandlere</w:t>
+        <w:t>B.1. Godkendte underdatabehandlere</w:t>
       </w:r>
     </w:p>
     <w:p>
@@ -4798,13 +4169,7 @@
         <w:jc w:val="both"/>
       </w:pPr>
       <w:r>
-        <w:t xml:space="preserve">Ved Bestemmelsernes ikrafttræden har den dataansvarlige godkendt brugen af ovennævnte underdatabehandlere for den beskrevne behandlingsaktivitet. Databehandleren må ikke – uden den dataansvarliges skriftlige godkendelse – gøre brug af en underdatabehandler til en anden behandlingsaktivitet end den </w:t>
-      </w:r>
-      <w:r>
-        <w:t>beskrevne og aftalte</w:t>
-      </w:r>
-      <w:r>
-        <w:t xml:space="preserve"> eller gøre brug af en anden underdatabehandler til denne behandlingsaktivitet.</w:t>
+        <w:t>Ved Bestemmelsernes ikrafttræden har den dataansvarlige godkendt brugen af ovennævnte underdatabehandlere for den beskrevne behandlingsaktivitet. Databehandleren må ikke – uden den dataansvarliges skriftlige godkendelse – gøre brug af en underdatabehandler til en anden behandlingsaktivitet end den beskrevne og aftalte eller gøre brug af en anden underdatabehandler til denne behandlingsaktivitet.</w:t>
       </w:r>
     </w:p>
     <w:p>
@@ -4824,19 +4189,7 @@
         <w:rPr>
           <w:b/>
         </w:rPr>
-        <w:t>B.2</w:t>
-      </w:r>
-      <w:r>
-        <w:rPr>
-          <w:b/>
-        </w:rPr>
-        <w:t>.</w:t>
-      </w:r>
-      <w:r>
-        <w:rPr>
-          <w:b/>
-        </w:rPr>
-        <w:t xml:space="preserve"> Varsel for godkendelse af underdatabehandlere</w:t>
+        <w:t>B.2. Varsel for godkendelse af underdatabehandlere</w:t>
       </w:r>
     </w:p>
     <w:p/>
@@ -4854,7 +4207,7 @@
           <w:numId w:val="0"/>
         </w:numPr>
       </w:pPr>
-      <w:bookmarkStart w:id="16" w:name="_Toc237035754"/>
+      <w:bookmarkStart w:id="16" w:name="_Toc237039936"/>
       <w:r>
         <w:lastRenderedPageBreak/>
         <w:t xml:space="preserve">Bilag C </w:t>
@@ -4884,55 +4237,450 @@
         <w:rPr>
           <w:b/>
         </w:rPr>
-        <w:t>C.1</w:t>
+        <w:t xml:space="preserve">C.1. </w:t>
       </w:r>
       <w:r>
         <w:rPr>
           <w:b/>
         </w:rPr>
-        <w:t>.</w:t>
-      </w:r>
+        <w:t>Behandlingens genstand/instruks</w:t>
+      </w:r>
+    </w:p>
+    <w:p>
+      <w:pPr>
+        <w:jc w:val="both"/>
+      </w:pPr>
+      <w:r>
+        <w:t>Databehandlerens behandling af personoplysninger på vegne af den dataansvarlige sker ved, at databehandleren udfører følgende:</w:t>
+      </w:r>
+    </w:p>
+    <w:p>
+      <w:pPr>
+        <w:jc w:val="both"/>
+      </w:pPr>
+    </w:p>
+    <w:p>
+      <w:pPr>
+        <w:jc w:val="both"/>
+      </w:pPr>
+      <w:r>
+        <w:t xml:space="preserve">Databehandleren instrueres i alene at behandle de i bilag A beskrevne oplysninger for at levere, sikre, vedligeholde og supportere SkoleGPS.dk for den dataansvarlige. Databehandleren må ikke anvende oplysningerne til egne markedsføringsformål, videresalg, reklameprofilering eller træning af offentlige AI-modeller. Den dataansvarlige instruerer sine brugere i at anvende holdnavn eller kort fornavn frem for fuldt navn, undgå særlige kategorier og undlade at fotografere genkendelige personer. AI-funktioner må </w:t>
+      </w:r>
+      <w:r>
+        <w:t>ikke modtage elevdata eller andet personhenførbart materiale.</w:t>
+      </w:r>
+    </w:p>
+    <w:p>
+      <w:pPr>
+        <w:jc w:val="both"/>
+        <w:rPr>
+          <w:b/>
+        </w:rPr>
+      </w:pPr>
+    </w:p>
+    <w:p>
+      <w:pPr>
+        <w:jc w:val="both"/>
+        <w:rPr>
+          <w:b/>
+        </w:rPr>
+      </w:pPr>
+      <w:r>
+        <w:rPr>
+          <w:b/>
+        </w:rPr>
+        <w:t>C.2. Behandlingssikkerhed</w:t>
+      </w:r>
+    </w:p>
+    <w:p>
+      <w:pPr>
+        <w:jc w:val="both"/>
+      </w:pPr>
+      <w:r>
+        <w:t>Sikkerhedsniveauet skal afspejle:</w:t>
+      </w:r>
+    </w:p>
+    <w:p>
+      <w:pPr>
+        <w:jc w:val="both"/>
+      </w:pPr>
+    </w:p>
+    <w:p>
+      <w:pPr>
+        <w:jc w:val="both"/>
+      </w:pPr>
+      <w:r>
+        <w:t>Behandlingen vedrører navnlig børn og unge og kan under aktive løb omfatte præcis lokation, svar og fotos. Selv om særlige kategorier ikke er tilsigtet, kan et foto eller fritekstsvar utilsigtet afsløre følsomme forhold. Sikkerhedsniveauet skal derfor være højt for elevdata, og adgangen skal begrænses til den relevante lærer, den enkelte deltagers egen aktive session og strengt nødvendige driftsfunktioner. Kommunen afgør, om behandlingen kræver en konsekvensanalyse (DPIA).</w:t>
+      </w:r>
+    </w:p>
+    <w:p>
+      <w:pPr>
+        <w:jc w:val="both"/>
+      </w:pPr>
+      <w:r>
+        <w:t>Databehandleren er herefter berettiget og forpligtet til at træffe beslutninger om, hvilke tekniske og organisatoriske sikkerhedsforanstaltninger, der skal gennemføres for at etableret det nødvendige (og aftalte) sikkerhedsniveau.</w:t>
+      </w:r>
+    </w:p>
+    <w:p>
+      <w:pPr>
+        <w:jc w:val="both"/>
+      </w:pPr>
+    </w:p>
+    <w:p>
+      <w:pPr>
+        <w:jc w:val="both"/>
+      </w:pPr>
+      <w:r>
+        <w:t>Databehandleren skal dog – under alle omstændigheder og som minimum – gennemføre følgende foranstaltninger, som er aftalt med den dataansvarlige:</w:t>
+      </w:r>
+    </w:p>
+    <w:p>
+      <w:pPr>
+        <w:jc w:val="both"/>
+      </w:pPr>
+    </w:p>
+    <w:p>
+      <w:pPr>
+        <w:jc w:val="both"/>
+        <w:rPr>
+          <w:highlight w:val="yellow"/>
+        </w:rPr>
+      </w:pPr>
+      <w:r>
+        <w:t>Elever deltager uden elevkonto og bør angive holdnavn eller kort fornavn. Interne UUID'er bruges til bruger-, sessions- og deltagerbinding. Delingslinks bruger en rå hemmelighed i URL-fragmentet, som fjernes fra browserens synlige historik efter aflæsning; alene SHA-256-digest lagres. Transport sker via HTTPS/TLS. Kryptering i hvile hos hosting-/databaseleverandører skal dokumenteres via deres aktuelle sikkerheds- og DPA-materiale.</w:t>
+      </w:r>
+    </w:p>
+    <w:p>
+      <w:pPr>
+        <w:jc w:val="both"/>
+        <w:rPr>
+          <w:highlight w:val="yellow"/>
+        </w:rPr>
+      </w:pPr>
+    </w:p>
+    <w:p>
+      <w:pPr>
+        <w:jc w:val="both"/>
+        <w:rPr>
+          <w:highlight w:val="yellow"/>
+        </w:rPr>
+      </w:pPr>
+      <w:r>
+        <w:t>Adgang styres med autentifikation, row-level security, ejerskabskontrol, deltagerbinding og server-only privilegerede nøgler. Rå service-nøgler må ikke eksponeres i klienten. Medarbejder- og administratoradgang følger mindst mulige rettigheder. Der er aktuelt én driftsansvarlig; enhver senere hjælper skal have dokumenteret fortrolighed og særskilt, behovsbestemt adgang. Ændringer testes før frigivelse, og kritiske elevflows afgrænses mod utilsigtede ændringer.</w:t>
+      </w:r>
+    </w:p>
+    <w:p>
+      <w:pPr>
+        <w:jc w:val="both"/>
+        <w:rPr>
+          <w:highlight w:val="yellow"/>
+        </w:rPr>
+      </w:pPr>
+    </w:p>
+    <w:p>
+      <w:pPr>
+        <w:jc w:val="both"/>
+        <w:rPr>
+          <w:highlight w:val="yellow"/>
+        </w:rPr>
+      </w:pPr>
+      <w:r>
+        <w:t>Driften baseres på hosting- og databaseleverandørernes til enhver tid gældende redundans og backupfunktioner. Der gives ikke en særskilt garanti for et bestemt RTO eller RPO i denne aftale. Databehandleren prioriterer genetablering og orienterer den dataansvarlige ved en hændelse. Leverandørernes dokumenterede backupretention gælder; Storage-objekter er ikke omfattet af Supabase-databasebackups. Kommunen kan kræve en særskilt kontinuitetsaftale før ibrugtagning.</w:t>
+      </w:r>
+    </w:p>
+    <w:p>
+      <w:pPr>
+        <w:jc w:val="both"/>
+        <w:rPr>
+          <w:highlight w:val="yellow"/>
+        </w:rPr>
+      </w:pPr>
+    </w:p>
+    <w:p>
+      <w:pPr>
+        <w:jc w:val="both"/>
+        <w:rPr>
+          <w:highlight w:val="yellow"/>
+        </w:rPr>
+      </w:pPr>
+      <w:r>
+        <w:t xml:space="preserve">Der anvendes typecheck, lint, build, målrettede automatiserede tests samt fokuserede browser- og sikkerhedstests ved væsentlige ændringer. Sikkerhedsrelevante migrationer gennemgås særskilt og afprøves isoleret, før de eventuelt køres mod hosted miljø. Afhængigheder og </w:t>
+      </w:r>
+      <w:r>
+        <w:lastRenderedPageBreak/>
+        <w:t>leverandørvilkår gennemgås løbende og mindst årligt i forbindelse med DPO-/tilsynsopfølgning.</w:t>
+      </w:r>
+    </w:p>
+    <w:p>
+      <w:pPr>
+        <w:jc w:val="both"/>
+        <w:rPr>
+          <w:highlight w:val="yellow"/>
+        </w:rPr>
+      </w:pPr>
+    </w:p>
+    <w:p>
+      <w:pPr>
+        <w:jc w:val="both"/>
+        <w:rPr>
+          <w:highlight w:val="yellow"/>
+        </w:rPr>
+      </w:pPr>
+      <w:r>
+        <w:t>Lærerområder kræver login. Elevadgang sker via kortvarig løbskode/QR til en aktiv session og bindes til en pseudonym deltageridentitet. Afsluttede eller ugyldige sessioner må ikke give adgang til nye data. Resultater er begrænset til løbets ejer. Delingslinks kan deaktiveres, må ikke indekseres eller caches og må ikke logges med rå token.</w:t>
+      </w:r>
+    </w:p>
+    <w:p>
+      <w:pPr>
+        <w:jc w:val="both"/>
+        <w:rPr>
+          <w:highlight w:val="yellow"/>
+        </w:rPr>
+      </w:pPr>
+    </w:p>
+    <w:p>
+      <w:pPr>
+        <w:jc w:val="both"/>
+        <w:rPr>
+          <w:highlight w:val="yellow"/>
+        </w:rPr>
+      </w:pPr>
+      <w:r>
+        <w:t>Al browser-, API- og leverandørtrafik skal ske over HTTPS/TLS. Autorisationsoplysninger og service-nøgler sendes kun i relevante beskyttede kanaler. URLs, fejlrapporter og analytics skal redigeres for PIN-koder, delingstokens, navne, deltager-id'er, svar, billeder og lokation.</w:t>
+      </w:r>
+    </w:p>
+    <w:p>
+      <w:pPr>
+        <w:jc w:val="both"/>
+        <w:rPr>
+          <w:highlight w:val="yellow"/>
+        </w:rPr>
+      </w:pPr>
+    </w:p>
+    <w:p>
+      <w:pPr>
+        <w:jc w:val="both"/>
+        <w:rPr>
+          <w:highlight w:val="yellow"/>
+        </w:rPr>
+      </w:pPr>
+      <w:r>
+        <w:t>Databaseadgang beskyttes med row-level security og serverkontrol. Fotoobjekter gemmes i en privat Storage-bucket. Visning kræver autentificeret lærer, kontrol af løbs-, svar- og fotoejerskab samt et kortlivet signed URL på 60 sekunder; Storage-stien udleveres ikke til browseren. Fotoopgaver må fortsat kun bruges til ting, steder og ikke-personhenførbare motiver. Læreren kan rydde fotos og øvrige elevdata fra resultatsiden, hvor Storage-objekt og databasepost slettes samlet.</w:t>
+      </w:r>
+    </w:p>
+    <w:p>
+      <w:pPr>
+        <w:jc w:val="both"/>
+        <w:rPr>
+          <w:highlight w:val="yellow"/>
+        </w:rPr>
+      </w:pPr>
+    </w:p>
+    <w:p>
+      <w:pPr>
+        <w:jc w:val="both"/>
+        <w:rPr>
+          <w:highlight w:val="yellow"/>
+        </w:rPr>
+      </w:pPr>
+      <w:r>
+        <w:t>Primær hosting og database drives i leverandørernes datacentre med deres fysiske kontroller. Databehandlerens lokale enheder skal være adgangskodebeskyttede, opdaterede og utilgængelige for uautoriserede. Lokale downloads af elevdata må ikke foretages, medmindre den dataansvarlige har givet dokumenteret instruks og opbevaring/sletning er aftalt.</w:t>
+      </w:r>
+    </w:p>
+    <w:p>
+      <w:pPr>
+        <w:jc w:val="both"/>
+        <w:rPr>
+          <w:highlight w:val="yellow"/>
+        </w:rPr>
+      </w:pPr>
+    </w:p>
+    <w:p>
+      <w:pPr>
+        <w:jc w:val="both"/>
+        <w:rPr>
+          <w:highlight w:val="yellow"/>
+        </w:rPr>
+      </w:pPr>
+      <w:r>
+        <w:t>Administrativ adgang fra hjemme-/fjernarbejdsplads må kun ske fra betroet, opdateret enhed over krypteret forbindelse og med stærk, unik adgangskode; multifaktorautentifikation skal være aktiveret, hvor leverandøren understøtter det. Skærm og session låses ved fravær, og elevdata må ikke udskrives eller deles via privat e-mail/chat.</w:t>
+      </w:r>
+    </w:p>
+    <w:p>
+      <w:pPr>
+        <w:jc w:val="both"/>
+        <w:rPr>
+          <w:highlight w:val="yellow"/>
+        </w:rPr>
+      </w:pPr>
+    </w:p>
+    <w:p>
+      <w:pPr>
+        <w:jc w:val="both"/>
+      </w:pPr>
+      <w:r>
+        <w:t xml:space="preserve">Der logges begrænsede drifts- og fejloplysninger. Sentry-integrationen fjerner brugerobjektet og redigerer navne, e-mail, PIN-/løbskoder, tokens, sessions- og deltager-id'er, svar, fotostier, signed URLs og lokation. Delings- og fotoudleveringsflow er fravalgt i analytics. Vercel Analytics behandler tekniske besøgsdata. Bugsnag findes som en betinget kodeintegration, men må ikke aktiveres til kommunal behandling uden skriftlig ændringsmeddelelse, leverandøraftale og tilsvarende global redaktion. Logdata må </w:t>
+      </w:r>
+      <w:r>
+        <w:t>ikke bruges til elevprofilering.</w:t>
+      </w:r>
+    </w:p>
+    <w:p>
+      <w:pPr>
+        <w:jc w:val="both"/>
+        <w:rPr>
+          <w:b/>
+        </w:rPr>
+      </w:pPr>
+    </w:p>
+    <w:p>
+      <w:pPr>
+        <w:jc w:val="both"/>
+        <w:rPr>
+          <w:b/>
+        </w:rPr>
+      </w:pPr>
+      <w:r>
+        <w:rPr>
+          <w:b/>
+        </w:rPr>
+        <w:t>C.3 Bistand til den dataansvarlige</w:t>
+      </w:r>
+    </w:p>
+    <w:p>
+      <w:pPr>
+        <w:jc w:val="both"/>
+      </w:pPr>
+      <w:r>
+        <w:t>Databehandleren skal så vidt muligt – inden for det nedenstående omfang og udstrækning – bistå den dataansvarlige i overensstemmelse med Bestemmelse 9.1 og 9.2 ved at gennemføre følgende tekniske og organisatoriske foranstaltninger:</w:t>
+      </w:r>
+    </w:p>
+    <w:p>
+      <w:pPr>
+        <w:jc w:val="both"/>
+      </w:pPr>
+    </w:p>
+    <w:p>
+      <w:pPr>
+        <w:jc w:val="both"/>
+        <w:rPr>
+          <w:highlight w:val="yellow"/>
+        </w:rPr>
+      </w:pPr>
+      <w:r>
+        <w:t>Databehandleren bistår uden unødig forsinkelse med søgning, adgangsbegrænsning, rettelse, sletning, eksport hvor teknisk muligt, håndtering af registreredes anmodninger, vurdering af sikkerhedsbrud, dokumentation til anmeldelse, konsekvensanalyse og forudgående høring. Henvendelser fra elever/forældre henvises som udgangspunkt til den dataansvarlige.</w:t>
+      </w:r>
+    </w:p>
+    <w:p>
+      <w:pPr>
+        <w:jc w:val="both"/>
+        <w:rPr>
+          <w:highlight w:val="yellow"/>
+        </w:rPr>
+      </w:pPr>
+    </w:p>
+    <w:p>
+      <w:pPr>
+        <w:jc w:val="both"/>
+      </w:pPr>
+      <w:r>
+        <w:t>Læreren kan fra resultatsiden slette billeder, besvarelser, deltagere og live-sessioner for et løb. Databehandleren kan efter verificeret instruks bistå med yderligere sletning. Ved brud leveres om muligt inden for 24 timer en foreløbig beskrivelse af hændelsen, berørte kategorier, omtrentligt omfang, sandsynlige konsekvenser og trufne/foreslåede afhjælpninger; manglende oplysninger eftersendes løbende.</w:t>
+      </w:r>
+    </w:p>
+    <w:p>
+      <w:pPr>
+        <w:jc w:val="both"/>
+        <w:rPr>
+          <w:b/>
+        </w:rPr>
+      </w:pPr>
+    </w:p>
+    <w:p>
+      <w:pPr>
+        <w:jc w:val="both"/>
+        <w:rPr>
+          <w:b/>
+        </w:rPr>
+      </w:pPr>
+      <w:r>
+        <w:rPr>
+          <w:b/>
+        </w:rPr>
+        <w:t>C.4 Opbevaringsperiode/sletterutine</w:t>
+      </w:r>
+    </w:p>
+    <w:p>
+      <w:pPr>
+        <w:rPr>
+          <w:highlight w:val="yellow"/>
+        </w:rPr>
+      </w:pPr>
+      <w:r>
+        <w:lastRenderedPageBreak/>
+        <w:t>1. Fotos: private Storage-objekter og billedreferencer slettes automatisk efter 30 dage. Læreren kan slette tidligere fra resultatsiden. Hosted cron skal aktiveres og verificeres efter deployment; indtil det er dokumenteret, er lærerens manuelle oprydning den bindende driftsprocedure.</w:t>
+      </w:r>
+      <w:r>
+        <w:br/>
+      </w:r>
+      <w:r>
+        <w:t>2. Øvrige elev-/sessionsdata: svar, deltagere, navne, beskeder og afsluttede live-sessioner slettes automatisk efter 90 dage. Læreren kan slette tidligere. Hosted aktivering skal dokumenteres, før automatisk sletning oplyses som aktiv i produktion.</w:t>
+      </w:r>
+      <w:r>
+        <w:br/>
+        <w:t>3. Aktuel position: overskrives løbende, nulstilles ved afslutning/forladelse og efter 15 minutters inaktivitet. Positionsfelter gemmes ikke i arkiverede svar.</w:t>
+      </w:r>
+      <w:r>
+        <w:br/>
+      </w:r>
+      <w:r>
+        <w:t>4. Lærerkonto og lærerskabte løb: opbevares, mens kontoen/aftalen er aktiv, og slettes efter dokumenteret anmodning eller ved ophør, bortset fra lovpligtig opbevaring.</w:t>
+      </w:r>
+      <w:r>
+        <w:br/>
+        <w:t>5. Tekniske oprydningslogs uden elevoplysninger slettes efter 30 dage. Øvrige driftslogs/backups følger de skriftligt godkendte leverandørvilkår; særskilte kommunale krav aftales skriftligt.</w:t>
+      </w:r>
+      <w:r>
+        <w:br/>
+      </w:r>
+      <w:r>
+        <w:t>6. Ved aftalens ophør slettes personoplysninger og eksisterende kopier i aktive systemer uden unødig forsinkelse; rester i lovlige, lukkede backups udløber efter leverandørens godkendte retention og må ikke bruges til andre formål. Databehandleren bekræfter sletningen skriftligt.</w:t>
+      </w:r>
+    </w:p>
+    <w:p>
+      <w:pPr>
+        <w:jc w:val="both"/>
+        <w:rPr>
+          <w:b/>
+        </w:rPr>
+      </w:pPr>
       <w:r>
         <w:rPr>
           <w:b/>
         </w:rPr>
         <w:t xml:space="preserve"> </w:t>
       </w:r>
-      <w:r>
+    </w:p>
+    <w:p>
+      <w:pPr>
+        <w:jc w:val="both"/>
         <w:rPr>
           <w:b/>
         </w:rPr>
-        <w:t>Behandlingens genstand/instruks</w:t>
-      </w:r>
-    </w:p>
-    <w:p>
-      <w:pPr>
-        <w:jc w:val="both"/>
-      </w:pPr>
-      <w:r>
-        <w:t>Databehandlerens behandling af personoplysninger på vegne af den dataansvarlige sker ved, at databehandleren udfører følgende:</w:t>
-      </w:r>
-    </w:p>
-    <w:p>
-      <w:pPr>
-        <w:jc w:val="both"/>
-      </w:pPr>
-    </w:p>
-    <w:p>
-      <w:pPr>
-        <w:jc w:val="both"/>
-      </w:pPr>
-      <w:r>
-        <w:t>Databehandleren instrueres i alene at behandle de i bilag A beskrevne oplysninger for at levere, sikre, vedligeholde og supportere SkoleGPS.dk for den dataansvarlige. Databehandleren må ikke anvende oplysningerne til egne markedsføringsformål, videresalg, reklameprofilering eller træning af offentlige AI-modeller. Den dataansvarlige instruerer sine brugere i at anvende holdnavn eller kort fornavn frem for fuldt navn, undgå særlige kategorier og undlade at fotografere genkendelige personer. AI-funktioner må ikke modtage elevdata eller andet personhenførbart materiale.</w:t>
-      </w:r>
-    </w:p>
-    <w:p>
-      <w:pPr>
-        <w:jc w:val="both"/>
+      </w:pPr>
+      <w:r>
         <w:rPr>
           <w:b/>
         </w:rPr>
-      </w:pPr>
+        <w:t>C.5 Lokalitet for behandling</w:t>
+      </w:r>
+    </w:p>
+    <w:p>
+      <w:pPr>
+        <w:jc w:val="both"/>
+      </w:pPr>
+      <w:r>
+        <w:t>Behandling af de af Bestemmelserne omfattede personoplysninger kan ikke uden den dataansvarliges forudgående skriftlige godkendelse ske på andre lokaliteter end følgende:</w:t>
+      </w:r>
     </w:p>
     <w:p>
       <w:pPr>
@@ -4941,366 +4689,97 @@
           <w:b/>
         </w:rPr>
       </w:pPr>
-      <w:r>
+    </w:p>
+    <w:p>
+      <w:r>
+        <w:t>• SkoleGPS' applikationsdrift: Vercel Inc.; behandling i USA og andre lokationer efter leverandørens gældende DPA, underdatabehandlerliste og overførselsgrundlag.</w:t>
+      </w:r>
+      <w:r>
+        <w:br/>
+        <w:t>• Database, autentifikation og Storage: Supabase, Inc.; den lokalt tilknyttede projektkonfiguration angiver region eu-west-1 (Irland), mens support, backups og underleverandører kan indebære andre lokationer efter leverandørens gældende DPA.</w:t>
+      </w:r>
+      <w:r>
+        <w:br/>
+      </w:r>
+      <w:r>
+        <w:t>• Fejlmonitorering: Functional Software, Inc. (Sentry); valgt datalagringsregion Tyskland, med support og underleverandører efter leverandørens gældende DPA.</w:t>
+      </w:r>
+      <w:r>
+        <w:br/>
+        <w:t>• Lærerrettet AI: OpenAI Ireland Ltd. efter gældende DPA og underdatabehandlerliste, hvis læreren frivilligt bruger funktionen; elevdata må ikke sendes.</w:t>
+      </w:r>
+      <w:r>
+        <w:br/>
+        <w:t>• Databehandlerens administrative arbejde: Sandbergvej 29, 4760 Vordingborg, Danmark.</w:t>
+      </w:r>
+      <w:r>
+        <w:br/>
+        <w:t>Andre lokaliteter eller væsentlige ændringer kræver skriftlig godkendelse efter bilag B.</w:t>
+      </w:r>
+    </w:p>
+    <w:p>
+      <w:pPr>
+        <w:jc w:val="both"/>
         <w:rPr>
           <w:b/>
         </w:rPr>
-        <w:t>C.2</w:t>
-      </w:r>
-      <w:r>
+      </w:pPr>
+    </w:p>
+    <w:p>
+      <w:pPr>
+        <w:jc w:val="both"/>
         <w:rPr>
           <w:b/>
         </w:rPr>
-        <w:t>.</w:t>
-      </w:r>
+      </w:pPr>
       <w:r>
         <w:rPr>
           <w:b/>
         </w:rPr>
-        <w:t xml:space="preserve"> </w:t>
+        <w:t xml:space="preserve">C.6 </w:t>
       </w:r>
       <w:r>
         <w:rPr>
           <w:b/>
         </w:rPr>
-        <w:t>Behandlingssikkerhed</w:t>
-      </w:r>
-    </w:p>
-    <w:p>
-      <w:pPr>
-        <w:jc w:val="both"/>
-      </w:pPr>
-      <w:r>
-        <w:t>Sikkerhedsniveauet skal afspejle:</w:t>
-      </w:r>
-    </w:p>
-    <w:p>
-      <w:pPr>
-        <w:jc w:val="both"/>
-      </w:pPr>
-    </w:p>
-    <w:p>
-      <w:pPr>
-        <w:jc w:val="both"/>
-      </w:pPr>
-      <w:r>
-        <w:t>Behandlingen vedrører navnlig børn og unge og kan under aktive løb omfatte præcis lokation, svar og fotos. Selv om særlige kategorier ikke er tilsigtet, kan et foto eller fritekstsvar utilsigtet afsløre følsomme forhold. Sikkerhedsniveauet skal derfor være højt for elevdata, og adgangen skal begrænses til den relevante lærer, den enkelte deltagers egen aktive session og strengt nødvendige driftsfunktioner. Kommunen afgør, om behandlingen kræver en konsekvensanalyse (DPIA).</w:t>
-      </w:r>
-    </w:p>
-    <w:p>
-      <w:pPr>
-        <w:jc w:val="both"/>
-      </w:pPr>
-      <w:r>
-        <w:t xml:space="preserve">Databehandleren er herefter berettiget og forpligtet til at træffe beslutninger om, hvilke tekniske og organisatoriske sikkerhedsforanstaltninger, der skal </w:t>
-      </w:r>
-      <w:r>
-        <w:t>gennemføres</w:t>
-      </w:r>
-      <w:r>
-        <w:t xml:space="preserve"> for at etableret det nødvendige (og aftalte) sikkerhedsniveau.</w:t>
-      </w:r>
-    </w:p>
-    <w:p>
-      <w:pPr>
-        <w:jc w:val="both"/>
-      </w:pPr>
-    </w:p>
-    <w:p>
-      <w:pPr>
-        <w:jc w:val="both"/>
-      </w:pPr>
-      <w:r>
-        <w:t xml:space="preserve">Databehandleren skal dog – </w:t>
-      </w:r>
-      <w:r>
-        <w:t>under alle omstændigheder</w:t>
-      </w:r>
-      <w:r>
-        <w:t xml:space="preserve"> og som minimum </w:t>
-      </w:r>
-      <w:r>
-        <w:t>–</w:t>
-      </w:r>
-      <w:r>
-        <w:t xml:space="preserve"> </w:t>
-      </w:r>
-      <w:r>
-        <w:t>gennemføre følgende for</w:t>
-      </w:r>
-      <w:r>
-        <w:t>anstaltninger, som er aftalt med den dataansvarlige:</w:t>
-      </w:r>
-    </w:p>
-    <w:p>
-      <w:pPr>
-        <w:jc w:val="both"/>
-      </w:pPr>
-    </w:p>
-    <w:p>
-      <w:pPr>
-        <w:jc w:val="both"/>
-        <w:rPr>
-          <w:highlight w:val="yellow"/>
-        </w:rPr>
-      </w:pPr>
-      <w:r>
-        <w:t>Elever deltager uden elevkonto og bør angive holdnavn eller kort fornavn. Interne UUID'er bruges til bruger-, sessions- og deltagerbinding. Delingslinks bruger en rå hemmelighed i URL-fragmentet, som fjernes fra browserens synlige historik efter aflæsning; alene SHA-256-digest lagres. Transport sker via HTTPS/TLS. Kryptering i hvile hos hosting-/databaseleverandører skal dokumenteres via deres aktuelle sikkerheds- og DPA-materiale.</w:t>
-      </w:r>
-    </w:p>
-    <w:p>
-      <w:pPr>
-        <w:jc w:val="both"/>
-        <w:rPr>
-          <w:highlight w:val="yellow"/>
-        </w:rPr>
-      </w:pPr>
-    </w:p>
-    <w:p>
-      <w:pPr>
-        <w:jc w:val="both"/>
-        <w:rPr>
-          <w:highlight w:val="yellow"/>
-        </w:rPr>
-      </w:pPr>
-      <w:r>
-        <w:t>Adgang styres med autentifikation, row-level security, ejerskabskontrol, deltagerbinding og server-only privilegerede nøgler. Rå service-nøgler må ikke eksponeres i klienten. Medarbejder- og administratoradgang følger mindst mulige rettigheder. Der er aktuelt én driftsansvarlig; enhver senere hjælper skal have dokumenteret fortrolighed og særskilt, behovsbestemt adgang. Ændringer testes før frigivelse, og kritiske elevflows afgrænses mod utilsigtede ændringer.</w:t>
-      </w:r>
-    </w:p>
-    <w:p>
-      <w:pPr>
-        <w:jc w:val="both"/>
-        <w:rPr>
-          <w:highlight w:val="yellow"/>
-        </w:rPr>
-      </w:pPr>
-    </w:p>
-    <w:p>
-      <w:pPr>
-        <w:jc w:val="both"/>
-        <w:rPr>
-          <w:highlight w:val="yellow"/>
-        </w:rPr>
-      </w:pPr>
-      <w:r>
-        <w:t>Driften baseres på hosting- og databaseleverandørernes til enhver tid gældende redundans og backupfunktioner. Der gives ikke en særskilt garanti for et bestemt RTO eller RPO i denne aftale. Databehandleren prioriterer genetablering og orienterer den dataansvarlige ved en hændelse. Leverandørernes dokumenterede backupretention gælder; Storage-objekter er ikke omfattet af Supabase-databasebackups. Kommunen kan kræve en særskilt kontinuitetsaftale før ibrugtagning.</w:t>
-      </w:r>
-    </w:p>
-    <w:p>
-      <w:pPr>
-        <w:jc w:val="both"/>
-        <w:rPr>
-          <w:highlight w:val="yellow"/>
-        </w:rPr>
-      </w:pPr>
-    </w:p>
-    <w:p>
-      <w:pPr>
-        <w:jc w:val="both"/>
-        <w:rPr>
-          <w:highlight w:val="yellow"/>
-        </w:rPr>
-      </w:pPr>
-      <w:r>
-        <w:t xml:space="preserve">Der anvendes typecheck, lint, build, målrettede automatiserede tests samt fokuserede browser- og sikkerhedstests ved væsentlige ændringer. Sikkerhedsrelevante migrationer gennemgås særskilt og afprøves isoleret, før de eventuelt køres mod hosted miljø. Afhængigheder og </w:t>
-      </w:r>
-      <w:r>
-        <w:lastRenderedPageBreak/>
-        <w:t>leverandørvilkår gennemgås løbende og mindst årligt i forbindelse med DPO-/tilsynsopfølgning.</w:t>
-      </w:r>
-    </w:p>
-    <w:p>
-      <w:pPr>
-        <w:jc w:val="both"/>
-        <w:rPr>
-          <w:highlight w:val="yellow"/>
-        </w:rPr>
-      </w:pPr>
-    </w:p>
-    <w:p>
-      <w:pPr>
-        <w:jc w:val="both"/>
-        <w:rPr>
-          <w:highlight w:val="yellow"/>
-        </w:rPr>
-      </w:pPr>
-      <w:r>
-        <w:t>Lærerområder kræver login. Elevadgang sker via kortvarig løbskode/QR til en aktiv session og bindes til en pseudonym deltageridentitet. Afsluttede eller ugyldige sessioner må ikke give adgang til nye data. Resultater er begrænset til løbets ejer. Delingslinks kan deaktiveres, må ikke indekseres eller caches og må ikke logges med rå token.</w:t>
-      </w:r>
-    </w:p>
-    <w:p>
-      <w:pPr>
-        <w:jc w:val="both"/>
-        <w:rPr>
-          <w:highlight w:val="yellow"/>
-        </w:rPr>
-      </w:pPr>
-    </w:p>
-    <w:p>
-      <w:pPr>
-        <w:jc w:val="both"/>
-        <w:rPr>
-          <w:highlight w:val="yellow"/>
-        </w:rPr>
-      </w:pPr>
-      <w:r>
-        <w:t>Al browser-, API- og leverandørtrafik skal ske over HTTPS/TLS. Autorisationsoplysninger og service-nøgler sendes kun i relevante beskyttede kanaler. URLs, fejlrapporter og analytics skal redigeres for PIN-koder, delingstokens, navne, deltager-id'er, svar, billeder og lokation.</w:t>
-      </w:r>
-    </w:p>
-    <w:p>
-      <w:pPr>
-        <w:jc w:val="both"/>
-        <w:rPr>
-          <w:highlight w:val="yellow"/>
-        </w:rPr>
-      </w:pPr>
-    </w:p>
-    <w:p>
-      <w:pPr>
-        <w:jc w:val="both"/>
-        <w:rPr>
-          <w:highlight w:val="yellow"/>
-        </w:rPr>
-      </w:pPr>
-      <w:r>
-        <w:t>Databaseadgang beskyttes med row-level security og serverkontrol. Fotoobjekter gemmes i den offentligt læsbare Storage-bucket participant-uploads under lange, tilfældige objektstier. Derfor må fotoopgaver kun bruges til ting, steder og ikke-personhenførbare motiver; genkendelige personer og andet personhenførbart indhold må ikke fotograferes. Koden indeholder en 30-dages oprydningsfunktion for fotoobjektet og nulstilling af billedlinket, men aftalen lover ikke automatisk sletning, før driftsaktiveringen er dokumenteret. Læreren kan rydde fotos og øvrige elevdata fra resultatsiden.</w:t>
-      </w:r>
-    </w:p>
-    <w:p>
-      <w:pPr>
-        <w:jc w:val="both"/>
-        <w:rPr>
-          <w:highlight w:val="yellow"/>
-        </w:rPr>
-      </w:pPr>
-    </w:p>
-    <w:p>
-      <w:pPr>
-        <w:jc w:val="both"/>
-        <w:rPr>
-          <w:highlight w:val="yellow"/>
-        </w:rPr>
-      </w:pPr>
-      <w:r>
-        <w:t>Primær hosting og database drives i leverandørernes datacentre med deres fysiske kontroller. Databehandlerens lokale enheder skal være adgangskodebeskyttede, opdaterede og utilgængelige for uautoriserede. Lokale downloads af elevdata må ikke foretages, medmindre den dataansvarlige har givet dokumenteret instruks og opbevaring/sletning er aftalt.</w:t>
-      </w:r>
-    </w:p>
-    <w:p>
-      <w:pPr>
-        <w:jc w:val="both"/>
-        <w:rPr>
-          <w:highlight w:val="yellow"/>
-        </w:rPr>
-      </w:pPr>
-    </w:p>
-    <w:p>
-      <w:pPr>
-        <w:jc w:val="both"/>
-        <w:rPr>
-          <w:highlight w:val="yellow"/>
-        </w:rPr>
-      </w:pPr>
-      <w:r>
-        <w:t>Administrativ adgang fra hjemme-/fjernarbejdsplads må kun ske fra betroet, opdateret enhed over krypteret forbindelse og med stærk, unik adgangskode; multifaktorautentifikation skal være aktiveret, hvor leverandøren understøtter det. Skærm og session låses ved fravær, og elevdata må ikke udskrives eller deles via privat e-mail/chat.</w:t>
-      </w:r>
-    </w:p>
-    <w:p>
-      <w:pPr>
-        <w:jc w:val="both"/>
-        <w:rPr>
-          <w:highlight w:val="yellow"/>
-        </w:rPr>
-      </w:pPr>
-    </w:p>
-    <w:p>
-      <w:pPr>
-        <w:jc w:val="both"/>
-      </w:pPr>
-      <w:r>
-        <w:t>Der logges begrænsede drifts- og fejloplysninger. Sentry-integrationen fjerner brugerobjektet og redigerer navne, e-mail, PIN-/løbskoder, tokens, sessions- og deltager-id'er, svar, fotos og lokation. Delingssiden er fravalgt i analytics og netværksdetaljer. Vercel Analytics behandler tekniske besøgsdata. Bugsnag findes som en betinget kodeintegration, men må ikke aktiveres til kommunal behandling uden skriftlig ændringsmeddelelse, leverandøraftale og tilsvarende global redaktion. Logdata må ikke bruges til elevprofilering.</w:t>
-      </w:r>
-    </w:p>
-    <w:p>
-      <w:pPr>
-        <w:jc w:val="both"/>
-        <w:rPr>
-          <w:b/>
-        </w:rPr>
-      </w:pPr>
-    </w:p>
-    <w:p>
-      <w:pPr>
-        <w:jc w:val="both"/>
-        <w:rPr>
-          <w:b/>
-        </w:rPr>
-      </w:pPr>
-      <w:r>
-        <w:rPr>
-          <w:b/>
-        </w:rPr>
-        <w:t xml:space="preserve">C.3 </w:t>
-      </w:r>
-      <w:r>
-        <w:rPr>
-          <w:b/>
-        </w:rPr>
-        <w:t>Bistand til den dataansvarlige</w:t>
-      </w:r>
-    </w:p>
-    <w:p>
-      <w:pPr>
-        <w:jc w:val="both"/>
-      </w:pPr>
-      <w:r>
-        <w:t xml:space="preserve">Databehandleren skal så vidt muligt – inden for </w:t>
-      </w:r>
-      <w:r>
-        <w:t xml:space="preserve">det nedenstående </w:t>
-      </w:r>
-      <w:r>
-        <w:t>omfang</w:t>
-      </w:r>
-      <w:r>
-        <w:t xml:space="preserve"> og </w:t>
-      </w:r>
-      <w:r>
-        <w:t xml:space="preserve">udstrækning </w:t>
-      </w:r>
-      <w:r>
-        <w:t>– bistå den dataansvarlige i overensstemmelse med Bestemmelse 9.1 og 9.2 ved at gennemføre følgende tekniske og organisatoriske foranstaltninger:</w:t>
-      </w:r>
-    </w:p>
-    <w:p>
-      <w:pPr>
-        <w:jc w:val="both"/>
-      </w:pPr>
-    </w:p>
-    <w:p>
-      <w:pPr>
-        <w:jc w:val="both"/>
-        <w:rPr>
-          <w:highlight w:val="yellow"/>
-        </w:rPr>
-      </w:pPr>
-      <w:r>
-        <w:t>Databehandleren bistår uden unødig forsinkelse med søgning, adgangsbegrænsning, rettelse, sletning, eksport hvor teknisk muligt, håndtering af registreredes anmodninger, vurdering af sikkerhedsbrud, dokumentation til anmeldelse, konsekvensanalyse og forudgående høring. Henvendelser fra elever/forældre henvises som udgangspunkt til den dataansvarlige.</w:t>
-      </w:r>
-    </w:p>
-    <w:p>
-      <w:pPr>
-        <w:jc w:val="both"/>
-        <w:rPr>
-          <w:highlight w:val="yellow"/>
-        </w:rPr>
-      </w:pPr>
-    </w:p>
-    <w:p>
-      <w:pPr>
-        <w:jc w:val="both"/>
-      </w:pPr>
-      <w:r>
-        <w:t>Læreren kan fra resultatsiden slette billeder, besvarelser, deltagere og live-sessioner for et løb. Databehandleren kan efter verificeret instruks bistå med yderligere sletning. Ved brud leveres om muligt inden for 24 timer en foreløbig beskrivelse af hændelsen, berørte kategorier, omtrentligt omfang, sandsynlige konsekvenser og trufne/foreslåede afhjælpninger; manglende oplysninger eftersendes løbende.</w:t>
+        <w:t>Instruks vedrørende overførsel af personoplysninger til tredjelande</w:t>
+      </w:r>
+    </w:p>
+    <w:p>
+      <w:pPr>
+        <w:jc w:val="both"/>
+      </w:pPr>
+      <w:r>
+        <w:t>Den dataansvarlige instruerer kun til overførsel uden for EØS, hvis den konkrete leverandør, behandlingsaktivitet, lokation og overførselsmekanisme fremgår af bilag B/C og er skriftligt godkendt. Overførsler skal baseres på en gyldig afgørelse om tilstrækkeligt beskyttelsesniveau, EU-Kommissionens standardkontraktbestemmelser og nødvendige supplerende foranstaltninger eller andet gyldigt kapitel V-grundlag. Kommunen foretager/vedligeholder den nødvendige overførselsvurdering.</w:t>
+      </w:r>
+    </w:p>
+    <w:p>
+      <w:pPr>
+        <w:jc w:val="both"/>
+      </w:pPr>
+    </w:p>
+    <w:p>
+      <w:pPr>
+        <w:jc w:val="both"/>
+      </w:pPr>
+      <w:r>
+        <w:t>For Vercel, Supabase, Sentry og OpenAI anvendes leverandørernes gældende DPA, underdatabehandlerliste og relevante overførselsgrundlag. Databehandleren må kun aktivere en leverandør til kommunens personoplysninger, når den konkrete konto og plan er omfattet af et gyldigt databehandlergrundlag. Væsentlige ændringer varsles efter bilag B.</w:t>
+      </w:r>
+    </w:p>
+    <w:p>
+      <w:pPr>
+        <w:jc w:val="both"/>
+      </w:pPr>
+    </w:p>
+    <w:p>
+      <w:pPr>
+        <w:jc w:val="both"/>
+      </w:pPr>
+      <w:r>
+        <w:t>Hvis den dataansvarlige ikke i disse Bestemmelser</w:t>
+      </w:r>
+      <w:r>
+        <w:t xml:space="preserve"> eller efterfølgende giver en dokumenteret instruks vedrørende overførsels af personoplysninger til et tredjeland, er databehandleren ikke berettiget til inden for rammerne af disse Bestemmelser at foretage sådanne overførsler.</w:t>
       </w:r>
     </w:p>
     <w:p>
@@ -5323,238 +4802,18 @@
           <w:b/>
         </w:rPr>
         <w:lastRenderedPageBreak/>
-        <w:t xml:space="preserve">C.4 </w:t>
-      </w:r>
-      <w:r>
-        <w:rPr>
-          <w:b/>
-        </w:rPr>
-        <w:t>Opbevaringsperiode/sletterutine</w:t>
-      </w:r>
-    </w:p>
-    <w:p>
-      <w:pPr>
-        <w:rPr>
-          <w:highlight w:val="yellow"/>
-        </w:rPr>
-      </w:pPr>
-      <w:r>
-        <w:t>1. Fotos: koden indeholder oprydning af Storage-objekt og nulstilling af billedlink efter 30 dage. Da den hostede planlægningsstatus ikke kan dokumenteres i denne standardskabelon, er lærerens manuelle oprydning den bindende sletteprocedure.</w:t>
-      </w:r>
-      <w:r>
-        <w:br/>
-        <w:t>2. Øvrige elev-/sessionsdata: den dataansvarlige instruerer lærerne i at rydde data senest 30 dage efter aktiviteten, medmindre et kortere dokumenteret formål gælder. Koden dokumenterer aktuelt manuel, ikke universel automatisk tidsbaseret, sletning.</w:t>
-      </w:r>
-      <w:r>
-        <w:br/>
-        <w:t>3. Aktuel position: overskrives løbende og slettes sammen med deltager-/sessionsdata.</w:t>
-      </w:r>
-      <w:r>
-        <w:br/>
-        <w:t>4. Lærerkonto og lærerskabte løb: opbevares, mens kontoen/aftalen er aktiv, og slettes efter dokumenteret anmodning eller ved ophør, bortset fra lovpligtig opbevaring.</w:t>
-      </w:r>
-      <w:r>
-        <w:br/>
-        <w:t>5. Driftslogs/backups: den til enhver tid gældende retention i de skriftligt godkendte leverandørvilkår gælder; særskilte kommunale krav skal aftales skriftligt.</w:t>
-      </w:r>
-      <w:r>
-        <w:br/>
-        <w:t>6. Ved aftalens ophør slettes personoplysninger og eksisterende kopier i aktive systemer uden unødig forsinkelse; rester i lovlige, lukkede backups udløber efter leverandørens godkendte retention og må ikke bruges til andre formål. Databehandleren bekræfter sletningen skriftligt.</w:t>
-      </w:r>
-    </w:p>
-    <w:p>
-      <w:pPr>
-        <w:jc w:val="both"/>
-        <w:rPr>
-          <w:b/>
-        </w:rPr>
-      </w:pPr>
-      <w:r>
-        <w:rPr>
-          <w:b/>
-        </w:rPr>
-        <w:t xml:space="preserve"> </w:t>
-      </w:r>
-    </w:p>
-    <w:p>
-      <w:pPr>
-        <w:jc w:val="both"/>
-        <w:rPr>
-          <w:b/>
-        </w:rPr>
-      </w:pPr>
-      <w:r>
-        <w:rPr>
-          <w:b/>
-        </w:rPr>
-        <w:t xml:space="preserve">C.5 </w:t>
-      </w:r>
-      <w:r>
-        <w:rPr>
-          <w:b/>
-        </w:rPr>
-        <w:t>Lokalitet for behandling</w:t>
-      </w:r>
-    </w:p>
-    <w:p>
-      <w:pPr>
-        <w:jc w:val="both"/>
-      </w:pPr>
-      <w:r>
-        <w:t>Behandling af de af Bestemmelserne omfattede personoplysninger kan ikke uden den dataansvarliges forudgående skriftlige godkendelse ske på andre lokaliteter end følgende:</w:t>
-      </w:r>
-    </w:p>
-    <w:p>
-      <w:pPr>
-        <w:jc w:val="both"/>
-        <w:rPr>
-          <w:b/>
-        </w:rPr>
-      </w:pPr>
-    </w:p>
-    <w:p>
-      <w:r>
-        <w:t>• SkoleGPS' applikationsdrift: Vercel Inc.; behandling i USA og andre lokationer efter leverandørens gældende DPA, underdatabehandlerliste og overførselsgrundlag.</w:t>
-      </w:r>
-      <w:r>
-        <w:br/>
-        <w:t>• Database, autentifikation og Storage: Supabase, Inc.; den lokalt tilknyttede projektkonfiguration angiver region eu-west-1 (Irland), mens support, backups og underleverandører kan indebære andre lokationer efter leverandørens gældende DPA.</w:t>
-      </w:r>
-      <w:r>
-        <w:br/>
-        <w:t>• Fejlmonitorering: Functional Software, Inc. (Sentry); valgt datalagringsregion Tyskland, med support og underleverandører efter leverandørens gældende DPA.</w:t>
-      </w:r>
-      <w:r>
-        <w:br/>
-        <w:t>• Lærerrettet AI: OpenAI Ireland Ltd. efter gældende DPA og underdatabehandlerliste, hvis læreren frivilligt bruger funktionen; elevdata må ikke sendes.</w:t>
-      </w:r>
-      <w:r>
-        <w:br/>
-        <w:t>• Databehandlerens administrative arbejde: Sandbergvej 29, 4760 Vordingborg, Danmark.</w:t>
-      </w:r>
-      <w:r>
-        <w:br/>
-        <w:t>Andre lokaliteter eller væsentlige ændringer kræver skriftlig godkendelse efter bilag B.</w:t>
-      </w:r>
-    </w:p>
-    <w:p>
-      <w:pPr>
-        <w:jc w:val="both"/>
-        <w:rPr>
-          <w:b/>
-        </w:rPr>
-      </w:pPr>
-    </w:p>
-    <w:p>
-      <w:pPr>
-        <w:jc w:val="both"/>
-        <w:rPr>
-          <w:b/>
-        </w:rPr>
-      </w:pPr>
-      <w:r>
-        <w:rPr>
-          <w:b/>
-        </w:rPr>
-        <w:t xml:space="preserve">C.6 </w:t>
-      </w:r>
-      <w:r>
-        <w:rPr>
-          <w:b/>
-        </w:rPr>
-        <w:t>Instruks vedrørende overførsel af personoplysninger til tredjelande</w:t>
-      </w:r>
-    </w:p>
-    <w:p>
-      <w:pPr>
-        <w:jc w:val="both"/>
-      </w:pPr>
-      <w:r>
-        <w:t>Den dataansvarlige instruerer kun til overførsel uden for EØS, hvis den konkrete leverandør, behandlingsaktivitet, lokation og overførselsmekanisme fremgår af bilag B/C og er skriftligt godkendt. Overførsler skal baseres på en gyldig afgørelse om tilstrækkeligt beskyttelsesniveau, EU-Kommissionens standardkontraktbestemmelser og nødvendige supplerende foranstaltninger eller andet gyldigt kapitel V-grundlag. Kommunen foretager/vedligeholder den nødvendige overførselsvurdering.</w:t>
-      </w:r>
-    </w:p>
-    <w:p>
-      <w:pPr>
-        <w:jc w:val="both"/>
-      </w:pPr>
-    </w:p>
-    <w:p>
-      <w:pPr>
-        <w:jc w:val="both"/>
-      </w:pPr>
-      <w:r>
-        <w:t>For Vercel, Supabase, Sentry og OpenAI anvendes leverandørernes gældende DPA, underdatabehandlerliste og relevante overførselsgrundlag. Databehandleren må kun aktivere en leverandør til kommunens personoplysninger, når den konkrete konto og plan er omfattet af et gyldigt databehandlergrundlag. Væsentlige ændringer varsles efter bilag B.</w:t>
-      </w:r>
-    </w:p>
-    <w:p>
-      <w:pPr>
-        <w:jc w:val="both"/>
-      </w:pPr>
-    </w:p>
-    <w:p>
-      <w:pPr>
-        <w:jc w:val="both"/>
-      </w:pPr>
-      <w:r>
-        <w:t xml:space="preserve">Hvis den dataansvarlige ikke </w:t>
-      </w:r>
-      <w:r>
-        <w:t xml:space="preserve">i </w:t>
-      </w:r>
-      <w:r>
-        <w:t>disse Bestemmelser</w:t>
-      </w:r>
-      <w:r>
-        <w:t xml:space="preserve"> eller efterfølgende giver en dokumenteret instruks vedrørende overførsels af personoplysninger til et tredjeland, er databehandleren ikke berettiget til inden for rammerne af disse Bestemmelser at foretage sådanne overførsler.</w:t>
-      </w:r>
-    </w:p>
-    <w:p>
-      <w:pPr>
-        <w:jc w:val="both"/>
-        <w:rPr>
-          <w:b/>
-        </w:rPr>
-      </w:pPr>
-    </w:p>
-    <w:p>
-      <w:pPr>
-        <w:jc w:val="both"/>
-        <w:rPr>
-          <w:b/>
-        </w:rPr>
-      </w:pPr>
-      <w:r>
-        <w:rPr>
-          <w:b/>
-        </w:rPr>
-        <w:t xml:space="preserve">C.7 </w:t>
-      </w:r>
-      <w:r>
-        <w:rPr>
-          <w:b/>
-        </w:rPr>
-        <w:t xml:space="preserve">Procedurer for den dataansvarliges </w:t>
-      </w:r>
-      <w:r>
-        <w:rPr>
-          <w:b/>
-        </w:rPr>
-        <w:t>revisioner</w:t>
-      </w:r>
-      <w:r>
-        <w:rPr>
-          <w:b/>
-        </w:rPr>
-        <w:t>, herunder inspektioner, med behandlingen af personoplysninger, som er overladt til databehandleren</w:t>
-      </w:r>
-    </w:p>
-    <w:p>
-      <w:pPr>
-        <w:jc w:val="both"/>
-      </w:pPr>
-      <w:r>
-        <w:lastRenderedPageBreak/>
-        <w:t>Den dataansvarlige kan én gang årligt og ved konkret sikkerhedshændelse eller myndighedskrav anmode om dokumentation for efterlevelse. Databehandleren leverer inden rimelig frist relevante politikker, testresultater, leverandør-DPA'er, underdatabehandlerlister og anden tilgængelig dokumentation med nødvendige fortroligheds- og sikkerhedsbegrænsninger. Hvis dokumentationen ikke er tilstrækkelig, kan den dataansvarlige gennemføre en forholdsmæssig fjernrevision eller inspektion med mindst 30 dages varsel, medmindre et brud eller myndighedskrav nødvendiggør kortere varsel. Parterne aftaler omfang og omkostninger på forhånd; databehandleren afsætter rimelig nødvendig tid.</w:t>
+        <w:t>C.7 Procedurer for den dataansvarliges revisioner, herunder inspektioner, med behandlingen af personoplysninger, som er overladt til databehandleren</w:t>
+      </w:r>
+    </w:p>
+    <w:p>
+      <w:pPr>
+        <w:jc w:val="both"/>
+      </w:pPr>
+      <w:r>
+        <w:t>Den dataansvarlige kan én gang årligt og ved konkret sikkerhedshændelse eller myndighedskrav anmode om dokumentation for efterlevelse. Databehandleren leverer inden rimelig frist relevante politikker, testresultater, leverandør-DPA'er, underdatabehandlerlister og anden tilgængelig dokumentation med nødvendige fortroligheds- og sikkerhedsbegrænsninger. Hvis dokumentationen ikke er tilstrækkelig, kan den dataansvarlige gennemføre en forholdsmæssig fjernrevision eller inspektion med mindst 30 dages varsel, med</w:t>
+      </w:r>
+      <w:r>
+        <w:t>mindre et brud eller myndighedskrav nødvendiggør kortere varsel. Parterne aftaler omfang og omkostninger på forhånd; databehandleren afsætter rimelig nødvendig tid.</w:t>
       </w:r>
     </w:p>
     <w:p>
@@ -5584,7 +4843,10 @@
         <w:jc w:val="both"/>
       </w:pPr>
       <w:r>
-        <w:t>Databehandleren følger mindst årligt de godkendte underdatabehandleres aktuelle sikkerheds-, revisions- og databeskyttelsesdokumentation samt væsentlige ændringer og hændelser. Tilgængelige SOC-/ISO-erklæringer, DPA'er, underdatabehandlerlister og overførselsdokumentation indhentes eller henvises til efter anmodning. Den dataansvarlige kan kræve supplerende dokumentation eller gøre indsigelse efter bilag B. Hvis en væsentlig risiko ikke kan afhjælpes, må den pågældende underdatabehandler/funktion ikke anvendes til kommunens personoplysninger.</w:t>
+        <w:t>Databehandleren følger mindst årligt de godkendte underdatabehandleres aktuelle sikkerheds-, revisions- og databeskyttelsesdokumentation samt væsentlige ændringer og hændelser. Tilgængelige SOC-/ISO-erklæringer, DPA'er, underdatabehandlerlister og overførselsdokumentation indhentes eller henvises til efter anmodning. Den dataansvarlige kan kræve supplerende dokumentation eller gøre indsigelse efter bilag B. Hvis en væsentlig risiko ikke kan afhjælpes, må den pågældende underdatabehandler/funktion ikke anven</w:t>
+      </w:r>
+      <w:r>
+        <w:t>des til kommunens personoplysninger.</w:t>
       </w:r>
     </w:p>
     <w:p>
@@ -5603,7 +4865,7 @@
           <w:numId w:val="0"/>
         </w:numPr>
       </w:pPr>
-      <w:bookmarkStart w:id="17" w:name="_Toc237035755"/>
+      <w:bookmarkStart w:id="17" w:name="_Toc237039937"/>
       <w:r>
         <w:t>Bilag D</w:t>
       </w:r>
@@ -5624,7 +4886,7 @@
     </w:p>
     <w:p>
       <w:r>
-        <w:t>Dette dokument er Standarddatabehandleraftale – SkoleGPS, version 1.0, udgivet og senest opdateret 7. august 2026. Den downloadede fil er en ikke underskrevet standardskabelon baseret på Datatilsynets standardbestemmelser. Kommunen/skoleejeren udfylder egne parts-, kontakt- og underskriftsfelter og foretager sin egen juridiske, sikkerhedsmæssige og eventuelle DPIA-vurdering. Dokumentet er ikke en certificering eller myndighedsgodkendelse.</w:t>
+        <w:t>Dette dokument er Standarddatabehandleraftale – SkoleGPS, version 1.1, udgivet og senest opdateret 8. august 2026. Den downloadede fil er en ikke underskrevet standardskabelon baseret på Datatilsynets standardbestemmelser. Kommunen/skoleejeren udfylder egne parts-, kontakt- og underskriftsfelter og foretager sin egen juridiske, sikkerhedsmæssige og eventuelle DPIA-vurdering. Dokumentet er ikke en certificering eller myndighedsgodkendelse.</w:t>
       </w:r>
     </w:p>
     <w:p>
@@ -5666,7 +4928,7 @@
     </w:p>
     <w:p>
       <w:r>
-        <w:t>Fotoopgaver må i kommunal brug alene omfatte ting, steder eller andre ikke-personhenførbare motiver. Genkendelige personer, elevnavne, skærmbilleder med personoplysninger og andet personhenførbart eller fortroligt indhold må ikke fotograferes eller uploades. Ønsker kommunen senere personhenførbare fotos, kræver det en særskilt teknisk ændring til privat Storage, fornyet risikovurdering og en skriftlig ændring af denne instruks.</w:t>
+        <w:t>Fotoopgaver må i kommunal brug alene omfatte ting, steder eller andre ikke-personhenførbare motiver. Genkendelige personer, elevnavne, skærmbilleder med personoplysninger og andet personhenførbart eller fortroligt indhold må ikke fotograferes eller uploades. Fotoobjekter ligger i privat Storage og vises alene til løbets ejer via kortlivede signed URLs. Ønsker kommunen senere personhenførbare fotos, kræver det en fornyet risikovurdering og skriftlig ændring af instruksen.</w:t>
       </w:r>
     </w:p>
     <w:p>
@@ -5680,10 +4942,13 @@
     </w:p>
     <w:p>
       <w:r>
-        <w:t>SkoleGPS' browser kan hente kortfliser/geokodning fra OpenStreetMap/Nominatim, CARTO og Esri samt enkelte offentlige medieaktiver. Lærerens frivillige AI- og indholdsværktøjer kan benytte OpenAI, Pollinations, YouTube og Apple iTunes-søgning. Disse tjenester kan modtage brugerens IP-adresse, browsermetadata og den forespurgte kortflise/søgning direkte. Der sendes ikke tilsigtet elevnavn, elevsvar, elevfoto eller elevlokation til AI- og indholds</w:t>
+        <w:t xml:space="preserve">SkoleGPS' browser kan hente kortfliser/geokodning fra OpenStreetMap/Nominatim, CARTO og Esri samt enkelte offentlige medieaktiver. Lærerens frivillige AI- og indholdsværktøjer kan benytte OpenAI, Pollinations, YouTube og Apple iTunes-søgning. Disse tjenester kan modtage brugerens IP-adresse, browsermetadata og den forespurgte kortflise/søgning direkte. </w:t>
       </w:r>
       <w:r>
         <w:lastRenderedPageBreak/>
+        <w:t>Der sendes ikke tilsigtet elevnavn, elevsvar, elevfoto eller elevlokation til AI- og indholds</w:t>
+      </w:r>
+      <w:r>
         <w:t>værktøjerne. Kommunen skal instruere lærerne i kun at bruge ikke-personhenførbart materiale og kan beslutte at undlade de frivillige funktioner. Korttjenesterne modtager teknisk nødvendige IP- og forespørgselsdata.</w:t>
       </w:r>
     </w:p>
@@ -5710,16 +4975,16 @@
       </w:r>
       <w:r>
         <w:br/>
+      </w:r>
+      <w:r>
         <w:t>4. Om de frivillige lærerrettede AI- og indholdsfunktioner må anvendes.</w:t>
       </w:r>
       <w:r>
         <w:br/>
-        <w:t>5. Kommunens interne frist og ansvar for lærerens manuelle oprydning af elev-/sessionsdata.</w:t>
+        <w:t>5. Kommunens ansvar for tidligere manuel sletning og kontrol af de aftalte automatiske frister.</w:t>
       </w:r>
       <w:r>
         <w:br/>
-      </w:r>
-      <w:r>
         <w:t>6. Kommunens kontaktvej ved sikkerhedsbrud og anmodninger fra registrerede.</w:t>
       </w:r>
       <w:r>
@@ -5782,28 +5047,7 @@
         <w:sz w:val="17"/>
         <w:szCs w:val="17"/>
       </w:rPr>
-      <w:t xml:space="preserve">Standardkontraktsbestemmelser </w:t>
-    </w:r>
-    <w:r>
-      <w:rPr>
-        <w:sz w:val="17"/>
-        <w:szCs w:val="17"/>
-      </w:rPr>
-      <w:t>marts</w:t>
-    </w:r>
-    <w:r>
-      <w:rPr>
-        <w:sz w:val="17"/>
-        <w:szCs w:val="17"/>
-      </w:rPr>
-      <w:t xml:space="preserve"> 202</w:t>
-    </w:r>
-    <w:r>
-      <w:rPr>
-        <w:sz w:val="17"/>
-        <w:szCs w:val="17"/>
-      </w:rPr>
-      <w:t>4</w:t>
+      <w:t>Standardkontraktsbestemmelser marts 2024</w:t>
     </w:r>
   </w:p>
 </w:ftr>
@@ -5854,7 +5098,7 @@
         <mc:AlternateContent>
           <mc:Choice Requires="wps">
             <w:drawing>
-              <wp:anchor distT="0" distB="0" distL="114300" distR="114300" simplePos="0" relativeHeight="251659264" behindDoc="0" locked="0" layoutInCell="1" allowOverlap="1" wp14:anchorId="06F50DC2" wp14:editId="021D8B2B">
+              <wp:anchor distT="0" distB="0" distL="114300" distR="114300" simplePos="0" relativeHeight="251659264" behindDoc="0" locked="0" layoutInCell="1" allowOverlap="1" wp14:anchorId="6F40692B" wp14:editId="150F87D7">
                 <wp:simplePos x="0" y="0"/>
                 <wp:positionH relativeFrom="margin">
                   <wp:posOffset>900430</wp:posOffset>
@@ -5911,7 +5155,7 @@
           </mc:Choice>
           <mc:Fallback>
             <w:pict>
-              <v:line w14:anchorId="29F9728E" id="Straight Connector 3" o:spid="_x0000_s1026" style="position:absolute;z-index:251659264;visibility:visible;mso-wrap-style:square;mso-width-percent:0;mso-wrap-distance-left:9pt;mso-wrap-distance-top:0;mso-wrap-distance-right:9pt;mso-wrap-distance-bottom:0;mso-position-horizontal:absolute;mso-position-horizontal-relative:margin;mso-position-vertical:absolute;mso-position-vertical-relative:page;mso-width-percent:0;mso-width-relative:margin" from="70.9pt,258pt" to="136.1pt,258pt" o:gfxdata="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" strokecolor="#c59e54 [3214]" strokeweight="1pt">
+              <v:line w14:anchorId="22D0298E" id="Straight Connector 3" o:spid="_x0000_s1026" style="position:absolute;z-index:251659264;visibility:visible;mso-wrap-style:square;mso-width-percent:0;mso-wrap-distance-left:9pt;mso-wrap-distance-top:0;mso-wrap-distance-right:9pt;mso-wrap-distance-bottom:0;mso-position-horizontal:absolute;mso-position-horizontal-relative:margin;mso-position-vertical:absolute;mso-position-vertical-relative:page;mso-width-percent:0;mso-width-relative:margin" from="70.9pt,258pt" to="136.1pt,258pt" o:gfxdata="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" strokecolor="#c59e54 [3214]" strokeweight="1pt">
                 <w10:wrap anchorx="margin" anchory="page"/>
               </v:line>
             </w:pict>
@@ -5943,12 +5187,7 @@
       </w:r>
       <w:r>
         <w:tab/>
-      </w:r>
-      <w:r>
-        <w:t>Henvisninger til ”m</w:t>
-      </w:r>
-      <w:r>
-        <w:t>edlemsstat” i disse bestemmelse skal forstås som en henvisning til ”EØS medlemsstater”.</w:t>
+        <w:t>Henvisninger til ”medlemsstat” i disse bestemmelse skal forstås som en henvisning til ”EØS medlemsstater”.</w:t>
       </w:r>
     </w:p>
   </w:footnote>
@@ -6035,11 +5274,21 @@
           <w:r>
             <w:t xml:space="preserve"> </w:t>
           </w:r>
-          <w:fldSimple w:instr=" NUMPAGES   \* MERGEFORMAT ">
-            <w:r>
-              <w:t>19</w:t>
-            </w:r>
-          </w:fldSimple>
+          <w:r>
+            <w:fldChar w:fldCharType="begin"/>
+          </w:r>
+          <w:r>
+            <w:instrText xml:space="preserve"> NUMPAGES   \* MERGEFORMAT </w:instrText>
+          </w:r>
+          <w:r>
+            <w:fldChar w:fldCharType="separate"/>
+          </w:r>
+          <w:r>
+            <w:t>19</w:t>
+          </w:r>
+          <w:r>
+            <w:fldChar w:fldCharType="end"/>
+          </w:r>
         </w:p>
       </w:tc>
     </w:tr>
@@ -11516,34 +10765,6 @@
 </file>
 
 <file path=customXml/item1.xml><?xml version="1.0" encoding="utf-8"?>
-<ns:datatilsynet_doctype xmlns:ns="http://www.getsharp.dk/datatilsynet/doctype" xmlns="http://www.getsharp.dk/datatilsynet/doctype">
-  <ns:documentinfo>
-    <ns:originaltemplate>Notat</ns:originaltemplate>
-    <ns:userinitials>MJH</ns:userinitials>
-  </ns:documentinfo>
-</ns:datatilsynet_doctype>
-</file>
-
-<file path=customXml/item2.xml><?xml version="1.0" encoding="utf-8"?>
-<Root xmlns="Workzone">
-  <data id="49EEA436-06AC-4EBB-BB5F-589B474AFE29">
-    <value>2019-11-27T00:00:00</value>
-  </data>
-  <data id="B9C8395A-22D1-4D7C-9486-93FBFBEAF2F3">
-    <value>156233</value>
-  </data>
-  <data id="4A247CA3-F186-4472-80F1-88BC39AA9062">
-    <value>2019-7310-0037</value>
-  </data>
-</Root>
-</file>
-
-<file path=customXml/item3.xml><?xml version="1.0" encoding="utf-8"?>
-<b:Sources xmlns:b="http://schemas.openxmlformats.org/officeDocument/2006/bibliography" xmlns="http://schemas.openxmlformats.org/officeDocument/2006/bibliography" SelectedStyle="\APASixthEditionOfficeOnline.xsl" StyleName="APA" Version="6">
-</b:Sources>
-</file>
-
-<file path=customXml/item4.xml><?xml version="1.0" encoding="utf-8"?>
 <ns:datatilsynet_translations xmlns:ns="http://www.getsharp.dk/datatilsynet/translations" xmlns="http://www.getsharp.dk/datatilsynet/translations">
   <ns:translations>
     <ns:journalnumber>J.nr.</ns:journalnumber>
@@ -11561,15 +10782,51 @@
 </ns:datatilsynet_translations>
 </file>
 
+<file path=customXml/item2.xml><?xml version="1.0" encoding="utf-8"?>
+<b:Sources xmlns:b="http://schemas.openxmlformats.org/officeDocument/2006/bibliography" xmlns="http://schemas.openxmlformats.org/officeDocument/2006/bibliography" SelectedStyle="\APASixthEditionOfficeOnline.xsl" StyleName="APA" Version="6">
+</b:Sources>
+</file>
+
+<file path=customXml/item3.xml><?xml version="1.0" encoding="utf-8"?>
+<Root xmlns="Workzone">
+  <data id="49EEA436-06AC-4EBB-BB5F-589B474AFE29">
+    <value>2019-11-27T00:00:00</value>
+  </data>
+  <data id="B9C8395A-22D1-4D7C-9486-93FBFBEAF2F3">
+    <value>156233</value>
+  </data>
+  <data id="4A247CA3-F186-4472-80F1-88BC39AA9062">
+    <value>2019-7310-0037</value>
+  </data>
+</Root>
+</file>
+
+<file path=customXml/item4.xml><?xml version="1.0" encoding="utf-8"?>
+<ns:datatilsynet_doctype xmlns:ns="http://www.getsharp.dk/datatilsynet/doctype" xmlns="http://www.getsharp.dk/datatilsynet/doctype">
+  <ns:documentinfo>
+    <ns:originaltemplate>Notat</ns:originaltemplate>
+    <ns:userinitials>MJH</ns:userinitials>
+  </ns:documentinfo>
+</ns:datatilsynet_doctype>
+</file>
+
 <file path=customXml/itemProps1.xml><?xml version="1.0" encoding="utf-8"?>
-<ds:datastoreItem xmlns:ds="http://schemas.openxmlformats.org/officeDocument/2006/customXml" ds:itemID="{65ECF323-7E85-4F53-9B85-56E285952720}">
+<ds:datastoreItem xmlns:ds="http://schemas.openxmlformats.org/officeDocument/2006/customXml" ds:itemID="{1BBC29C5-0145-4EE8-9791-F79EF758C131}">
   <ds:schemaRefs>
-    <ds:schemaRef ds:uri="http://www.getsharp.dk/datatilsynet/doctype"/>
+    <ds:schemaRef ds:uri="http://www.getsharp.dk/datatilsynet/translations"/>
   </ds:schemaRefs>
 </ds:datastoreItem>
 </file>
 
 <file path=customXml/itemProps2.xml><?xml version="1.0" encoding="utf-8"?>
+<ds:datastoreItem xmlns:ds="http://schemas.openxmlformats.org/officeDocument/2006/customXml" ds:itemID="{72DA4FD6-97E5-4294-AE7D-93FC0EBC2472}">
+  <ds:schemaRefs>
+    <ds:schemaRef ds:uri="http://schemas.openxmlformats.org/officeDocument/2006/bibliography"/>
+  </ds:schemaRefs>
+</ds:datastoreItem>
+</file>
+
+<file path=customXml/itemProps3.xml><?xml version="1.0" encoding="utf-8"?>
 <ds:datastoreItem xmlns:ds="http://schemas.openxmlformats.org/officeDocument/2006/customXml" ds:itemID="{99103757-656A-46B7-B70E-427FCEE6F2FA}">
   <ds:schemaRefs>
     <ds:schemaRef ds:uri="Workzone"/>
@@ -11577,18 +10834,10 @@
 </ds:datastoreItem>
 </file>
 
-<file path=customXml/itemProps3.xml><?xml version="1.0" encoding="utf-8"?>
-<ds:datastoreItem xmlns:ds="http://schemas.openxmlformats.org/officeDocument/2006/customXml" ds:itemID="{72DA4FD6-97E5-4294-AE7D-93FC0EBC2472}">
+<file path=customXml/itemProps4.xml><?xml version="1.0" encoding="utf-8"?>
+<ds:datastoreItem xmlns:ds="http://schemas.openxmlformats.org/officeDocument/2006/customXml" ds:itemID="{65ECF323-7E85-4F53-9B85-56E285952720}">
   <ds:schemaRefs>
-    <ds:schemaRef ds:uri="http://schemas.openxmlformats.org/officeDocument/2006/bibliography"/>
-  </ds:schemaRefs>
-</ds:datastoreItem>
-</file>
-
-<file path=customXml/itemProps4.xml><?xml version="1.0" encoding="utf-8"?>
-<ds:datastoreItem xmlns:ds="http://schemas.openxmlformats.org/officeDocument/2006/customXml" ds:itemID="{1BBC29C5-0145-4EE8-9791-F79EF758C131}">
-  <ds:schemaRefs>
-    <ds:schemaRef ds:uri="http://www.getsharp.dk/datatilsynet/translations"/>
+    <ds:schemaRef ds:uri="http://www.getsharp.dk/datatilsynet/doctype"/>
   </ds:schemaRefs>
 </ds:datastoreItem>
 </file>
</xml_diff>

<commit_message>
fix: complete municipal release safety gate
</commit_message>
<xml_diff>
--- a/docs/legal/SkoleGPS_standarddatabehandleraftale.docx
+++ b/docs/legal/SkoleGPS_standarddatabehandleraftale.docx
@@ -12,10 +12,14 @@
       </w:r>
       <w:r>
         <w:br/>
-        <w:t>Version 1.1 · Udgivet og senest opdateret 8. august 2026 · Dokumentansvarlig: Jeppe Laursen, SkoleGPS.dk</w:t>
+      </w:r>
+      <w:r>
+        <w:t>Version 1.2 · Udgivet og senest opdateret 9. august 2026 · Dokumentansvarlig: Jeppe Laursen, SkoleGPS.dk</w:t>
       </w:r>
       <w:r>
         <w:br/>
+      </w:r>
+      <w:r>
         <w:t>Standardskabelonen skal udfyldes, vurderes og underskrives af den konkrete kommune/skoleejer og SkoleGPS. Den er ikke en myndighedsgodkendelse eller juridisk rådgivning.</w:t>
       </w:r>
     </w:p>
@@ -3632,10 +3636,7 @@
         <w:jc w:val="both"/>
       </w:pPr>
       <w:r>
-        <w:t>Behandlingen omfatter indsamling, registrering, organisering, opbevaring, løbende opdatering, visning, begrænset videregivelse til godkendte underdatabehandlere, fejlsøgning, sletning og sikkerhedskopiering. Under et aktivt løb modtages elevens aktuelle GPS-position og overskrives løbende på deltagerposten. Positionen nulstilles ved afslutning og skjules/slettes efter 15 minutters inaktivitet. Der opbygges ikke en særskilt positionshistorik for det normale løbsflow. Lærere kan dele et løb til afvikling; mod</w:t>
-      </w:r>
-      <w:r>
-        <w:t>tageren får en selvstændig kopi uden tidligere sessioner, deltagere, elevdata, resultater, PIN-koder eller live-status.</w:t>
+        <w:t>Behandlingen omfatter indsamling, registrering, organisering, opbevaring, løbende opdatering, visning, begrænset videregivelse til godkendte underdatabehandlere, fejlsøgning, sletning og sikkerhedskopiering. Under et aktivt løb modtages elevens aktuelle GPS-position og overskrives løbende på deltagerposten. Positionen er ikke synlig efter 15 minutters inaktivitet og nulstilles fysisk ved næste femminutters oprydning, normalt senest efter cirka 20 minutter. Afslutning eller forladelse nulstiller straks, hvor det er muligt. Der opbygges ikke en særskilt positionshistorik for det normale løbsflow. Lærere kan dele et løb til afvikling; modtageren får en selvstændig kopi uden tidligere sessioner, deltagere, elevdata, resultater, PIN-koder eller live-status.</w:t>
       </w:r>
     </w:p>
     <w:p>
@@ -4465,7 +4466,7 @@
         </w:rPr>
       </w:pPr>
       <w:r>
-        <w:t>Databaseadgang beskyttes med row-level security og serverkontrol. Fotoobjekter gemmes i en privat Storage-bucket. Visning kræver autentificeret lærer, kontrol af løbs-, svar- og fotoejerskab samt et kortlivet signed URL på 60 sekunder; Storage-stien udleveres ikke til browseren. Fotoopgaver må fortsat kun bruges til ting, steder og ikke-personhenførbare motiver. Læreren kan rydde fotos og øvrige elevdata fra resultatsiden, hvor Storage-objekt og databasepost slettes samlet.</w:t>
+        <w:t>Databaseadgang beskyttes med row-level security og serverkontrol. Fotoobjekter gemmes i en privat Storage-bucket. Visning kræver autentificeret lærer og kontrol af løbs-, svar- og fotoejerskab. En beskyttet, ikke-cachebar SkoleGPS-fotoproxy streamer derefter billedets bytes; hverken Storage-sti eller signed Storage-URL udleveres til browseren. Uploads dekodes med en fast grænse på 12 millioner pixels, rotation anvendes, og billedet genkodes som JPEG uden EXIF- eller GPS-metadata. Fotoopgaver må fortsat kun bruges til ting, steder og ikke-personhenførbare motiver. Læreren kan rydde fotos og øvrige elevdata fra resultatsiden, hvor Storage-objekt og databasepost slettes samlet.</w:t>
       </w:r>
     </w:p>
     <w:p>
@@ -4519,10 +4520,7 @@
         <w:jc w:val="both"/>
       </w:pPr>
       <w:r>
-        <w:t xml:space="preserve">Der logges begrænsede drifts- og fejloplysninger. Sentry-integrationen fjerner brugerobjektet og redigerer navne, e-mail, PIN-/løbskoder, tokens, sessions- og deltager-id'er, svar, fotostier, signed URLs og lokation. Delings- og fotoudleveringsflow er fravalgt i analytics. Vercel Analytics behandler tekniske besøgsdata. Bugsnag findes som en betinget kodeintegration, men må ikke aktiveres til kommunal behandling uden skriftlig ændringsmeddelelse, leverandøraftale og tilsvarende global redaktion. Logdata må </w:t>
-      </w:r>
-      <w:r>
-        <w:t>ikke bruges til elevprofilering.</w:t>
+        <w:t>Der logges begrænsede drifts- og fejloplysninger. Sentry aktiveres kun ved eksplicit konfiguration, fjerner bruger-, server-, request- og enhedskontekst og redigerer navne, e-mail, IP, PIN-/løbskoder, tokens, sessions- og deltager-id'er, svar, fotostier, URL-legitimationsoplysninger og lokation. Delings- og fotoudleveringsflow er fravalgt i analytics. Vercel Analytics behandler tekniske besøgsdata. Bugsnag findes som en betinget kodeintegration, men må ikke aktiveres til kommunal behandling uden skriftlig ændringsmeddelelse, leverandøraftale og tilsvarende global redaktion. Logdata må ikke bruges til elevprofilering.</w:t>
       </w:r>
     </w:p>
     <w:p>
@@ -4616,18 +4614,19 @@
         </w:rPr>
       </w:pPr>
       <w:r>
-        <w:lastRenderedPageBreak/>
         <w:t>1. Fotos: private Storage-objekter og billedreferencer slettes automatisk efter 30 dage. Læreren kan slette tidligere fra resultatsiden. Hosted cron skal aktiveres og verificeres efter deployment; indtil det er dokumenteret, er lærerens manuelle oprydning den bindende driftsprocedure.</w:t>
       </w:r>
       <w:r>
         <w:br/>
       </w:r>
       <w:r>
-        <w:t>2. Øvrige elev-/sessionsdata: svar, deltagere, navne, beskeder og afsluttede live-sessioner slettes automatisk efter 90 dage. Læreren kan slette tidligere. Hosted aktivering skal dokumenteres, før automatisk sletning oplyses som aktiv i produktion.</w:t>
+        <w:t>2. Øvrige elev-/sessionsdata: svar, deltagere, navne, beskeder og afsluttede live-sessioner slettes automatisk efter 90 dage fra afslutning eller dokumenteret inaktivitet. Aktive sessioner uden retentionsanker bevares. Læreren kan slette tidligere. Hosted aktivering skal dokumenteres, før automatisk sletning oplyses som aktiv i produktion.</w:t>
       </w:r>
       <w:r>
         <w:br/>
-        <w:t>3. Aktuel position: overskrives løbende, nulstilles ved afslutning/forladelse og efter 15 minutters inaktivitet. Positionsfelter gemmes ikke i arkiverede svar.</w:t>
+      </w:r>
+      <w:r>
+        <w:t>3. Aktuel position: overskrives løbende og er ikke synlig efter 15 minutters inaktivitet. Den nulstilles fysisk ved næste femminutters oprydning, normalt senest efter cirka 20 minutter, og straks ved afslutning/forladelse, hvor det er muligt. Positionsfelter gemmes ikke i arkiverede svar.</w:t>
       </w:r>
       <w:r>
         <w:br/>
@@ -4637,6 +4636,8 @@
       </w:r>
       <w:r>
         <w:br/>
+      </w:r>
+      <w:r>
         <w:t>5. Tekniske oprydningslogs uden elevoplysninger slettes efter 30 dage. Øvrige driftslogs/backups følger de skriftligt godkendte leverandørvilkår; særskilte kommunale krav aftales skriftligt.</w:t>
       </w:r>
       <w:r>
@@ -4886,7 +4887,7 @@
     </w:p>
     <w:p>
       <w:r>
-        <w:t>Dette dokument er Standarddatabehandleraftale – SkoleGPS, version 1.1, udgivet og senest opdateret 8. august 2026. Den downloadede fil er en ikke underskrevet standardskabelon baseret på Datatilsynets standardbestemmelser. Kommunen/skoleejeren udfylder egne parts-, kontakt- og underskriftsfelter og foretager sin egen juridiske, sikkerhedsmæssige og eventuelle DPIA-vurdering. Dokumentet er ikke en certificering eller myndighedsgodkendelse.</w:t>
+        <w:t>Dette dokument er Standarddatabehandleraftale – SkoleGPS, version 1.2, udgivet og senest opdateret 9. august 2026. Den downloadede fil er en ikke underskrevet standardskabelon baseret på Datatilsynets standardbestemmelser. Kommunen/skoleejeren udfylder egne parts-, kontakt- og underskriftsfelter og foretager sin egen juridiske, sikkerhedsmæssige og eventuelle DPIA-vurdering. Dokumentet er ikke en certificering eller myndighedsgodkendelse.</w:t>
       </w:r>
     </w:p>
     <w:p>
@@ -4928,7 +4929,7 @@
     </w:p>
     <w:p>
       <w:r>
-        <w:t>Fotoopgaver må i kommunal brug alene omfatte ting, steder eller andre ikke-personhenførbare motiver. Genkendelige personer, elevnavne, skærmbilleder med personoplysninger og andet personhenførbart eller fortroligt indhold må ikke fotograferes eller uploades. Fotoobjekter ligger i privat Storage og vises alene til løbets ejer via kortlivede signed URLs. Ønsker kommunen senere personhenførbare fotos, kræver det en fornyet risikovurdering og skriftlig ændring af instruksen.</w:t>
+        <w:t>Fotoopgaver må i kommunal brug alene omfatte ting, steder eller andre ikke-personhenførbare motiver. Genkendelige personer, elevnavne, skærmbilleder med personoplysninger og andet personhenførbart eller fortroligt indhold må ikke fotograferes eller uploades. Fotoobjekter ligger i privat Storage og streames kun til løbets ejer gennem en beskyttet, ikke-cachebar SkoleGPS-fotoproxy. Storage-stier og signed Storage-URLs udleveres ikke til browseren. Ønsker kommunen senere personhenførbare fotos, kræver det en fornyet risikovurdering og skriftlig ændring af instruksen.</w:t>
       </w:r>
     </w:p>
     <w:p>
@@ -4967,10 +4968,14 @@
       </w:r>
       <w:r>
         <w:br/>
+      </w:r>
+      <w:r>
         <w:t>2. Kommunens vurdering af behovet for en konsekvensanalyse (DPIA) ved børn og lokation.</w:t>
       </w:r>
       <w:r>
         <w:br/>
+      </w:r>
+      <w:r>
         <w:t>3. Om fotoopgaver med ikke-personhenførbare motiver må anvendes.</w:t>
       </w:r>
       <w:r>
@@ -4981,15 +4986,37 @@
       </w:r>
       <w:r>
         <w:br/>
+      </w:r>
+      <w:r>
         <w:t>5. Kommunens ansvar for tidligere manuel sletning og kontrol af de aftalte automatiske frister.</w:t>
       </w:r>
       <w:r>
         <w:br/>
+      </w:r>
+      <w:r>
         <w:t>6. Kommunens kontaktvej ved sikkerhedsbrud og anmodninger fra registrerede.</w:t>
       </w:r>
       <w:r>
         <w:br/>
+      </w:r>
+      <w:r>
         <w:t>7. Eventuelle supplerende krav til oppetid, support, revision, ansvar, forsikring, værneting og ophør i en særskilt hovedaftale.</w:t>
+      </w:r>
+    </w:p>
+    <w:p>
+      <w:pPr/>
+      <w:r>
+        <w:rPr>
+          <w:b/>
+          <w:sz w:val="22"/>
+        </w:rPr>
+        <w:t>D.7 Forberedt login-overdragelse til DagensTavle</w:t>
+      </w:r>
+    </w:p>
+    <w:p>
+      <w:pPr/>
+      <w:r>
+        <w:t>DagensTavle-SSO er forberedt bag feature flags og er ikke aktivt i produktion, før en senere godkendt deployment og konfiguration er verificeret. Når det aktiveres, overdrages kun lærerens stabile bruger-id, verificerede e-mail, visningsnavn og loginudbyder gennem en kortlivet, single-use serverforbindelse. Der anvendes alene identitets-scopes openid, email og profile. DagensTavle modtager ingen elevdata, løb, deltagere, svar, fotos, GPS, resultater, Supabase-session, JWT, OAuth-kode eller service-role-nøgle. De kortlivede request- og nonceværdier gemmes kun som hashes, udløber senest efter to minutter og kan slettes idempotent; DagensTavle opretter sin egen host-only session og kræver særskilt accept af egne vilkår.</w:t>
       </w:r>
     </w:p>
     <w:p/>
@@ -5214,7 +5241,7 @@
     <w:tr>
       <w:trPr>
         <w:cantSplit/>
-        <w:tblHeader/>
+        <w:tblHeader w:val="true"/>
       </w:trPr>
       <w:tc>
         <w:tcPr>

</xml_diff>